<commit_message>
Incorpora explicabilidad del modelo con SHAP
</commit_message>
<xml_diff>
--- a/reports/acif104_s6_grupo3_en-progreso.docx
+++ b/reports/acif104_s6_grupo3_en-progreso.docx
@@ -22332,22 +22332,662 @@
     </w:p>
     <w:p>
       <w:pPr>
-        <w:shd w:val="clear" w:color="auto" w:fill="FFF2CC"/>
-        <w:spacing w:before="60" w:after="180" w:line="276" w:lineRule="auto"/>
-        <w:ind w:left="216" w:right="216"/>
-        <w:rPr>
-          <w:rFonts w:asciiTheme="minorHAnsi" w:hAnsiTheme="minorHAnsi" w:cstheme="minorHAnsi"/>
-        </w:rPr>
-      </w:pPr>
-      <w:r>
-        <w:rPr>
-          <w:rFonts w:asciiTheme="minorHAnsi" w:hAnsiTheme="minorHAnsi" w:cstheme="minorHAnsi"/>
+        <w:spacing w:lineRule="auto" w:line="276" w:after="120"/>
+        <w:jc w:val="both"/>
+      </w:pPr>
+      <w:r>
+        <w:rPr>
+          <w:b w:val="0"/>
+        </w:rPr>
+        <w:t>Esta sección interpreta las predicciones del modelo definitivo (XGBoost + ROS refinado, sección 4.5.3) mediante SHAP (SHapley Additive exPlanations), en dos niveles: qué variables influyen más en promedio sobre el modelo (importancia global) y cómo se explica la predicción de clientes concretos (explicaciones locales). El detalle completo del análisis está en notebook/07_explicabilidad_shap.ipynb.</w:t>
+      </w:r>
+    </w:p>
+    <w:p>
+      <w:pPr>
+        <w:spacing w:lineRule="auto" w:line="276" w:after="120"/>
+        <w:jc w:val="both"/>
+      </w:pPr>
+      <w:r>
+        <w:rPr>
+          <w:b w:val="0"/>
+        </w:rPr>
+        <w:t>Nota metodológica: se intentó calcular los valores SHAP en espacio de probabilidad, para leerlos directamente como puntos de probabilidad de abandono. Ese modo no es compatible con los splits categóricos nativos que usa la versión actual de XGBoost, por lo que los valores presentados a continuación están en espacio de margen (log-odds): el signo indica si la variable empuja la predicción hacia el abandono (positivo) o hacia la permanencia (negativo), y la magnitud indica qué tan fuerte es ese empuje en relación con las demás variables del mismo caso. No deben leerse como puntos porcentuales de probabilidad.</w:t>
+      </w:r>
+    </w:p>
+    <w:p>
+      <w:pPr>
+        <w:spacing w:lineRule="auto" w:line="276" w:after="120"/>
+        <w:jc w:val="both"/>
+      </w:pPr>
+      <w:r>
+        <w:rPr>
+          <w:b w:val="0"/>
+        </w:rPr>
+        <w:t>La Tabla 15 y la Figura 18 muestran las variables con mayor importancia global, medida como el promedio del valor absoluto de SHAP sobre el conjunto de validación. csat_score, tenure_months, payment_failures y monthly_logins concentran la mayor parte de la importancia, en ese orden — las mismas cuatro variables que ya se habían identificado en el análisis exploratorio (sección 4.1.6) como las de mayor diferencia (Cohen's d) entre clientes que permanecen y abandonan. Esta coincidencia respalda que el modelo aprendió señales con sentido de negocio y no patrones espurios.</w:t>
+      </w:r>
+    </w:p>
+    <w:p>
+      <w:pPr>
+        <w:spacing w:lineRule="auto" w:line="276" w:after="120"/>
+        <w:jc w:val="both"/>
+      </w:pPr>
+      <w:r>
+        <w:rPr>
           <w:b/>
-          <w:i/>
-          <w:color w:val="7F6000"/>
-          <w:sz w:val="20"/>
-        </w:rPr>
-        <w:t>PENDIENTE DE COMPLETAR. Responsable: Diego. Incorporar importancia global, gráfico resumen, al menos tres explicaciones locales y un análisis comprensible de las variables que aumentan o reducen el riesgo. Aclarar que SHAP explica asociaciones del modelo y no relaciones causales.</w:t>
+        </w:rPr>
+        <w:t>Tabla 15. Importancia global de variables según SHAP (promedio de |valor| en validación).</w:t>
+      </w:r>
+    </w:p>
+    <w:tbl>
+      <w:tblPr>
+        <w:tblW w:type="auto" w:w="0"/>
+        <w:tblLook w:firstColumn="1" w:firstRow="1" w:lastColumn="0" w:lastRow="0" w:noHBand="0" w:noVBand="1" w:val="04A0"/>
+      </w:tblPr>
+      <w:tblGrid>
+        <w:gridCol w:w="5190"/>
+        <w:gridCol w:w="5190"/>
+      </w:tblGrid>
+      <w:tr>
+        <w:tc>
+          <w:tcPr>
+            <w:tcW w:type="dxa" w:w="5190"/>
+          </w:tcPr>
+          <w:p>
+            <w:r>
+              <w:t>Variable</w:t>
+            </w:r>
+          </w:p>
+        </w:tc>
+        <w:tc>
+          <w:tcPr>
+            <w:tcW w:type="dxa" w:w="5190"/>
+          </w:tcPr>
+          <w:p>
+            <w:r>
+              <w:t>Importancia media |SHAP|</w:t>
+            </w:r>
+          </w:p>
+        </w:tc>
+      </w:tr>
+      <w:tr>
+        <w:tc>
+          <w:tcPr>
+            <w:tcW w:type="dxa" w:w="5190"/>
+          </w:tcPr>
+          <w:p>
+            <w:r>
+              <w:t>csat_score</w:t>
+            </w:r>
+          </w:p>
+        </w:tc>
+        <w:tc>
+          <w:tcPr>
+            <w:tcW w:type="dxa" w:w="5190"/>
+          </w:tcPr>
+          <w:p>
+            <w:r>
+              <w:t>0,561</w:t>
+            </w:r>
+          </w:p>
+        </w:tc>
+      </w:tr>
+      <w:tr>
+        <w:tc>
+          <w:tcPr>
+            <w:tcW w:type="dxa" w:w="5190"/>
+          </w:tcPr>
+          <w:p>
+            <w:r>
+              <w:t>tenure_months</w:t>
+            </w:r>
+          </w:p>
+        </w:tc>
+        <w:tc>
+          <w:tcPr>
+            <w:tcW w:type="dxa" w:w="5190"/>
+          </w:tcPr>
+          <w:p>
+            <w:r>
+              <w:t>0,361</w:t>
+            </w:r>
+          </w:p>
+        </w:tc>
+      </w:tr>
+      <w:tr>
+        <w:tc>
+          <w:tcPr>
+            <w:tcW w:type="dxa" w:w="5190"/>
+          </w:tcPr>
+          <w:p>
+            <w:r>
+              <w:t>payment_failures</w:t>
+            </w:r>
+          </w:p>
+        </w:tc>
+        <w:tc>
+          <w:tcPr>
+            <w:tcW w:type="dxa" w:w="5190"/>
+          </w:tcPr>
+          <w:p>
+            <w:r>
+              <w:t>0,308</w:t>
+            </w:r>
+          </w:p>
+        </w:tc>
+      </w:tr>
+      <w:tr>
+        <w:tc>
+          <w:tcPr>
+            <w:tcW w:type="dxa" w:w="5190"/>
+          </w:tcPr>
+          <w:p>
+            <w:r>
+              <w:t>monthly_logins</w:t>
+            </w:r>
+          </w:p>
+        </w:tc>
+        <w:tc>
+          <w:tcPr>
+            <w:tcW w:type="dxa" w:w="5190"/>
+          </w:tcPr>
+          <w:p>
+            <w:r>
+              <w:t>0,228</w:t>
+            </w:r>
+          </w:p>
+        </w:tc>
+      </w:tr>
+      <w:tr>
+        <w:tc>
+          <w:tcPr>
+            <w:tcW w:type="dxa" w:w="5190"/>
+          </w:tcPr>
+          <w:p>
+            <w:r>
+              <w:t>last_login_days_ago</w:t>
+            </w:r>
+          </w:p>
+        </w:tc>
+        <w:tc>
+          <w:tcPr>
+            <w:tcW w:type="dxa" w:w="5190"/>
+          </w:tcPr>
+          <w:p>
+            <w:r>
+              <w:t>0,062</w:t>
+            </w:r>
+          </w:p>
+        </w:tc>
+      </w:tr>
+      <w:tr>
+        <w:tc>
+          <w:tcPr>
+            <w:tcW w:type="dxa" w:w="5190"/>
+          </w:tcPr>
+          <w:p>
+            <w:r>
+              <w:t>total_revenue</w:t>
+            </w:r>
+          </w:p>
+        </w:tc>
+        <w:tc>
+          <w:tcPr>
+            <w:tcW w:type="dxa" w:w="5190"/>
+          </w:tcPr>
+          <w:p>
+            <w:r>
+              <w:t>0,033</w:t>
+            </w:r>
+          </w:p>
+        </w:tc>
+      </w:tr>
+      <w:tr>
+        <w:tc>
+          <w:tcPr>
+            <w:tcW w:type="dxa" w:w="5190"/>
+          </w:tcPr>
+          <w:p>
+            <w:r>
+              <w:t>age</w:t>
+            </w:r>
+          </w:p>
+        </w:tc>
+        <w:tc>
+          <w:tcPr>
+            <w:tcW w:type="dxa" w:w="5190"/>
+          </w:tcPr>
+          <w:p>
+            <w:r>
+              <w:t>0,014</w:t>
+            </w:r>
+          </w:p>
+        </w:tc>
+      </w:tr>
+      <w:tr>
+        <w:tc>
+          <w:tcPr>
+            <w:tcW w:type="dxa" w:w="5190"/>
+          </w:tcPr>
+          <w:p>
+            <w:r>
+              <w:t>avg_session_time</w:t>
+            </w:r>
+          </w:p>
+        </w:tc>
+        <w:tc>
+          <w:tcPr>
+            <w:tcW w:type="dxa" w:w="5190"/>
+          </w:tcPr>
+          <w:p>
+            <w:r>
+              <w:t>0,013</w:t>
+            </w:r>
+          </w:p>
+        </w:tc>
+      </w:tr>
+    </w:tbl>
+    <w:p>
+      <w:r>
+        <w:rPr>
+          <w:b w:val="0"/>
+        </w:rPr>
+      </w:r>
+    </w:p>
+    <w:p>
+      <w:pPr>
+        <w:jc w:val="center"/>
+      </w:pPr>
+      <w:r>
+        <w:drawing>
+          <wp:inline xmlns:a="http://schemas.openxmlformats.org/drawingml/2006/main" xmlns:pic="http://schemas.openxmlformats.org/drawingml/2006/picture">
+            <wp:extent cx="5486400" cy="6099047"/>
+            <wp:docPr id="1950181908" name="Picture 1950181908"/>
+            <wp:cNvGraphicFramePr>
+              <a:graphicFrameLocks noChangeAspect="1"/>
+            </wp:cNvGraphicFramePr>
+            <a:graphic>
+              <a:graphicData uri="http://schemas.openxmlformats.org/drawingml/2006/picture">
+                <pic:pic>
+                  <pic:nvPicPr>
+                    <pic:cNvPr id="0" name="12_01_shap_importancia_global_bar.png"/>
+                    <pic:cNvPicPr/>
+                  </pic:nvPicPr>
+                  <pic:blipFill>
+                    <a:blip r:embed="rId47"/>
+                    <a:stretch>
+                      <a:fillRect/>
+                    </a:stretch>
+                  </pic:blipFill>
+                  <pic:spPr>
+                    <a:xfrm>
+                      <a:off x="0" y="0"/>
+                      <a:ext cx="5486400" cy="6099047"/>
+                    </a:xfrm>
+                    <a:prstGeom prst="rect"/>
+                  </pic:spPr>
+                </pic:pic>
+              </a:graphicData>
+            </a:graphic>
+          </wp:inline>
+        </w:drawing>
+      </w:r>
+    </w:p>
+    <w:p>
+      <w:pPr>
+        <w:spacing w:after="40"/>
+        <w:jc w:val="center"/>
+      </w:pPr>
+      <w:r>
+        <w:rPr>
+          <w:b w:val="0"/>
+          <w:sz w:val="18"/>
+        </w:rPr>
+        <w:t>Figura 18. Importancia global de variables según SHAP.</w:t>
+      </w:r>
+    </w:p>
+    <w:p>
+      <w:pPr>
+        <w:spacing w:after="120"/>
+        <w:jc w:val="center"/>
+      </w:pPr>
+      <w:r>
+        <w:rPr>
+          <w:b w:val="0"/>
+          <w:sz w:val="17"/>
+        </w:rPr>
+        <w:t>Fuente: elaboración propia.</w:t>
+      </w:r>
+    </w:p>
+    <w:p>
+      <w:pPr>
+        <w:spacing w:lineRule="auto" w:line="276" w:after="120"/>
+        <w:jc w:val="both"/>
+      </w:pPr>
+      <w:r>
+        <w:rPr>
+          <w:b w:val="0"/>
+        </w:rPr>
+        <w:t>La Figura 19 complementa esta vista agregada: muestra, para cada variable, cómo se distribuye su efecto entre los clientes del conjunto de validación. Valores bajos de csat_score, tenure_months y monthly_logins, junto con valores altos de payment_failures, empujan sistemáticamente la predicción hacia el abandono; sus opuestos empujan hacia la permanencia.</w:t>
+      </w:r>
+    </w:p>
+    <w:p>
+      <w:pPr>
+        <w:jc w:val="center"/>
+      </w:pPr>
+      <w:r>
+        <w:drawing>
+          <wp:inline xmlns:a="http://schemas.openxmlformats.org/drawingml/2006/main" xmlns:pic="http://schemas.openxmlformats.org/drawingml/2006/picture">
+            <wp:extent cx="5486400" cy="5182639"/>
+            <wp:docPr id="1950181909" name="Picture 1950181909"/>
+            <wp:cNvGraphicFramePr>
+              <a:graphicFrameLocks noChangeAspect="1"/>
+            </wp:cNvGraphicFramePr>
+            <a:graphic>
+              <a:graphicData uri="http://schemas.openxmlformats.org/drawingml/2006/picture">
+                <pic:pic>
+                  <pic:nvPicPr>
+                    <pic:cNvPr id="0" name="12_02_shap_resumen_beeswarm.png"/>
+                    <pic:cNvPicPr/>
+                  </pic:nvPicPr>
+                  <pic:blipFill>
+                    <a:blip r:embed="rId48"/>
+                    <a:stretch>
+                      <a:fillRect/>
+                    </a:stretch>
+                  </pic:blipFill>
+                  <pic:spPr>
+                    <a:xfrm>
+                      <a:off x="0" y="0"/>
+                      <a:ext cx="5486400" cy="5182639"/>
+                    </a:xfrm>
+                    <a:prstGeom prst="rect"/>
+                  </pic:spPr>
+                </pic:pic>
+              </a:graphicData>
+            </a:graphic>
+          </wp:inline>
+        </w:drawing>
+      </w:r>
+    </w:p>
+    <w:p>
+      <w:pPr>
+        <w:spacing w:after="40"/>
+        <w:jc w:val="center"/>
+      </w:pPr>
+      <w:r>
+        <w:rPr>
+          <w:b w:val="0"/>
+          <w:sz w:val="18"/>
+        </w:rPr>
+        <w:t>Figura 19. Resumen SHAP: dirección y magnitud del efecto de cada variable.</w:t>
+      </w:r>
+    </w:p>
+    <w:p>
+      <w:pPr>
+        <w:spacing w:after="120"/>
+        <w:jc w:val="center"/>
+      </w:pPr>
+      <w:r>
+        <w:rPr>
+          <w:b w:val="0"/>
+          <w:sz w:val="17"/>
+        </w:rPr>
+        <w:t>Fuente: elaboración propia.</w:t>
+      </w:r>
+    </w:p>
+    <w:p>
+      <w:pPr>
+        <w:spacing w:lineRule="auto" w:line="276" w:after="120"/>
+        <w:jc w:val="both"/>
+      </w:pPr>
+      <w:r>
+        <w:rPr>
+          <w:b w:val="0"/>
+        </w:rPr>
+        <w:t>Para ilustrar cómo se combinan estas señales en clientes concretos, se seleccionaron tres casos del conjunto de prueba: un verdadero positivo (abandono detectado correctamente), un falso positivo (alerta de riesgo en un cliente que finalmente permaneció) y un verdadero negativo confiado (probabilidad baja en un cliente que efectivamente permaneció). Los tres casos usan el mismo umbral de decisión (0,56) definido en la sección 4.5.3.</w:t>
+      </w:r>
+    </w:p>
+    <w:p>
+      <w:pPr>
+        <w:jc w:val="center"/>
+      </w:pPr>
+      <w:r>
+        <w:drawing>
+          <wp:inline xmlns:a="http://schemas.openxmlformats.org/drawingml/2006/main" xmlns:pic="http://schemas.openxmlformats.org/drawingml/2006/picture">
+            <wp:extent cx="5486400" cy="5023910"/>
+            <wp:docPr id="1950181910" name="Picture 1950181910"/>
+            <wp:cNvGraphicFramePr>
+              <a:graphicFrameLocks noChangeAspect="1"/>
+            </wp:cNvGraphicFramePr>
+            <a:graphic>
+              <a:graphicData uri="http://schemas.openxmlformats.org/drawingml/2006/picture">
+                <pic:pic>
+                  <pic:nvPicPr>
+                    <pic:cNvPr id="0" name="12_03_shap_local_verdadero_positivo.png"/>
+                    <pic:cNvPicPr/>
+                  </pic:nvPicPr>
+                  <pic:blipFill>
+                    <a:blip r:embed="rId49"/>
+                    <a:stretch>
+                      <a:fillRect/>
+                    </a:stretch>
+                  </pic:blipFill>
+                  <pic:spPr>
+                    <a:xfrm>
+                      <a:off x="0" y="0"/>
+                      <a:ext cx="5486400" cy="5023910"/>
+                    </a:xfrm>
+                    <a:prstGeom prst="rect"/>
+                  </pic:spPr>
+                </pic:pic>
+              </a:graphicData>
+            </a:graphic>
+          </wp:inline>
+        </w:drawing>
+      </w:r>
+    </w:p>
+    <w:p>
+      <w:pPr>
+        <w:spacing w:after="40"/>
+        <w:jc w:val="center"/>
+      </w:pPr>
+      <w:r>
+        <w:rPr>
+          <w:b w:val="0"/>
+          <w:sz w:val="18"/>
+        </w:rPr>
+        <w:t>Figura 20. Explicación local de un verdadero positivo (probabilidad = 0,94).</w:t>
+      </w:r>
+    </w:p>
+    <w:p>
+      <w:pPr>
+        <w:spacing w:after="120"/>
+        <w:jc w:val="center"/>
+      </w:pPr>
+      <w:r>
+        <w:rPr>
+          <w:b w:val="0"/>
+          <w:sz w:val="17"/>
+        </w:rPr>
+        <w:t>Fuente: elaboración propia.</w:t>
+      </w:r>
+    </w:p>
+    <w:p>
+      <w:pPr>
+        <w:spacing w:lineRule="auto" w:line="276" w:after="120"/>
+        <w:jc w:val="both"/>
+      </w:pPr>
+      <w:r>
+        <w:rPr>
+          <w:b w:val="0"/>
+        </w:rPr>
+        <w:t>Este cliente fue detectado correctamente como alto riesgo (probabilidad 0,941). Las variables que más empujaron la predicción hacia el abandono fueron monthly_logins, csat_score y payment_failures, todas en el sentido esperado (accesos y satisfacción muy por debajo del promedio, fallos de pago muy por encima): es el perfil que el proyecto busca detectar.</w:t>
+      </w:r>
+    </w:p>
+    <w:p>
+      <w:pPr>
+        <w:jc w:val="center"/>
+      </w:pPr>
+      <w:r>
+        <w:drawing>
+          <wp:inline xmlns:a="http://schemas.openxmlformats.org/drawingml/2006/main" xmlns:pic="http://schemas.openxmlformats.org/drawingml/2006/picture">
+            <wp:extent cx="5486400" cy="5044756"/>
+            <wp:docPr id="1950181911" name="Picture 1950181911"/>
+            <wp:cNvGraphicFramePr>
+              <a:graphicFrameLocks noChangeAspect="1"/>
+            </wp:cNvGraphicFramePr>
+            <a:graphic>
+              <a:graphicData uri="http://schemas.openxmlformats.org/drawingml/2006/picture">
+                <pic:pic>
+                  <pic:nvPicPr>
+                    <pic:cNvPr id="0" name="12_04_shap_local_falso_positivo.png"/>
+                    <pic:cNvPicPr/>
+                  </pic:nvPicPr>
+                  <pic:blipFill>
+                    <a:blip r:embed="rId50"/>
+                    <a:stretch>
+                      <a:fillRect/>
+                    </a:stretch>
+                  </pic:blipFill>
+                  <pic:spPr>
+                    <a:xfrm>
+                      <a:off x="0" y="0"/>
+                      <a:ext cx="5486400" cy="5044756"/>
+                    </a:xfrm>
+                    <a:prstGeom prst="rect"/>
+                  </pic:spPr>
+                </pic:pic>
+              </a:graphicData>
+            </a:graphic>
+          </wp:inline>
+        </w:drawing>
+      </w:r>
+    </w:p>
+    <w:p>
+      <w:pPr>
+        <w:spacing w:after="40"/>
+        <w:jc w:val="center"/>
+      </w:pPr>
+      <w:r>
+        <w:rPr>
+          <w:b w:val="0"/>
+          <w:sz w:val="18"/>
+        </w:rPr>
+        <w:t>Figura 21. Explicación local de un falso positivo (probabilidad = 0,94).</w:t>
+      </w:r>
+    </w:p>
+    <w:p>
+      <w:pPr>
+        <w:spacing w:after="120"/>
+        <w:jc w:val="center"/>
+      </w:pPr>
+      <w:r>
+        <w:rPr>
+          <w:b w:val="0"/>
+          <w:sz w:val="17"/>
+        </w:rPr>
+        <w:t>Fuente: elaboración propia.</w:t>
+      </w:r>
+    </w:p>
+    <w:p>
+      <w:pPr>
+        <w:spacing w:lineRule="auto" w:line="276" w:after="120"/>
+        <w:jc w:val="both"/>
+      </w:pPr>
+      <w:r>
+        <w:rPr>
+          <w:b w:val="0"/>
+        </w:rPr>
+        <w:t>El modelo asignó a este cliente una probabilidad casi idéntica (0,938), pero permaneció: es exactamente el tipo de alerta falsa que explica la precision baja del modelo (0,234 en prueba, Tabla 12). Las señales de riesgo —poca antigüedad, fallos de pago y muchos días sin acceder— pesaron más que su satisfacción por encima del promedio, que empujó en sentido contrario pero con menos fuerza. En otras palabras: el modelo ponderó más la inactividad y los problemas de pago que la buena satisfacción declarada, y en este caso se equivocó.</w:t>
+      </w:r>
+    </w:p>
+    <w:p>
+      <w:pPr>
+        <w:jc w:val="center"/>
+      </w:pPr>
+      <w:r>
+        <w:drawing>
+          <wp:inline xmlns:a="http://schemas.openxmlformats.org/drawingml/2006/main" xmlns:pic="http://schemas.openxmlformats.org/drawingml/2006/picture">
+            <wp:extent cx="5486400" cy="4982730"/>
+            <wp:docPr id="1950181912" name="Picture 1950181912"/>
+            <wp:cNvGraphicFramePr>
+              <a:graphicFrameLocks noChangeAspect="1"/>
+            </wp:cNvGraphicFramePr>
+            <a:graphic>
+              <a:graphicData uri="http://schemas.openxmlformats.org/drawingml/2006/picture">
+                <pic:pic>
+                  <pic:nvPicPr>
+                    <pic:cNvPr id="0" name="12_05_shap_local_verdadero_negativo.png"/>
+                    <pic:cNvPicPr/>
+                  </pic:nvPicPr>
+                  <pic:blipFill>
+                    <a:blip r:embed="rId51"/>
+                    <a:stretch>
+                      <a:fillRect/>
+                    </a:stretch>
+                  </pic:blipFill>
+                  <pic:spPr>
+                    <a:xfrm>
+                      <a:off x="0" y="0"/>
+                      <a:ext cx="5486400" cy="4982730"/>
+                    </a:xfrm>
+                    <a:prstGeom prst="rect"/>
+                  </pic:spPr>
+                </pic:pic>
+              </a:graphicData>
+            </a:graphic>
+          </wp:inline>
+        </w:drawing>
+      </w:r>
+    </w:p>
+    <w:p>
+      <w:pPr>
+        <w:spacing w:after="40"/>
+        <w:jc w:val="center"/>
+      </w:pPr>
+      <w:r>
+        <w:rPr>
+          <w:b w:val="0"/>
+          <w:sz w:val="18"/>
+        </w:rPr>
+        <w:t>Figura 22. Explicación local de un verdadero negativo confiado (probabilidad = 0,22).</w:t>
+      </w:r>
+    </w:p>
+    <w:p>
+      <w:pPr>
+        <w:spacing w:after="120"/>
+        <w:jc w:val="center"/>
+      </w:pPr>
+      <w:r>
+        <w:rPr>
+          <w:b w:val="0"/>
+          <w:sz w:val="17"/>
+        </w:rPr>
+        <w:t>Fuente: elaboración propia.</w:t>
+      </w:r>
+    </w:p>
+    <w:p>
+      <w:pPr>
+        <w:spacing w:lineRule="auto" w:line="276" w:after="120"/>
+        <w:jc w:val="both"/>
+      </w:pPr>
+      <w:r>
+        <w:rPr>
+          <w:b w:val="0"/>
+        </w:rPr>
+        <w:t>Este cliente fue clasificado con probabilidad baja (0,218) y efectivamente permaneció. Su satisfacción muy por encima del promedio fue, de lejos, la señal más fuerte hacia la permanencia, reforzada por una antigüedad y una cantidad de accesos también por encima del promedio: el perfil inverso al primer caso.</w:t>
+      </w:r>
+    </w:p>
+    <w:p>
+      <w:pPr>
+        <w:spacing w:lineRule="auto" w:line="276" w:after="120"/>
+        <w:jc w:val="both"/>
+      </w:pPr>
+      <w:r>
+        <w:rPr>
+          <w:b w:val="0"/>
+        </w:rPr>
+        <w:t>Estas explicaciones muestran qué variables usó el modelo para cada predicción, es decir, asociaciones aprendidas de los datos de entrenamiento; no son evidencia de relaciones causales. Por ejemplo, no puede afirmarse que mejorar artificialmente el csat_score de un cliente vaya a causar que deje de abandonar: ambas variables podrían responder a una causa común, como la calidad del soporte técnico. Para decisiones de retención, estas explicaciones sirven para priorizar y entender el riesgo detectado por el modelo, no como receta causal.</w:t>
       </w:r>
     </w:p>
     <w:p>

</xml_diff>

<commit_message>
Finalizar aplicación de predicción de churn
:wq#
</commit_message>
<xml_diff>
--- a/reports/acif104_s6_grupo3_en-progreso.docx
+++ b/reports/acif104_s6_grupo3_en-progreso.docx
@@ -1156,6 +1156,8 @@
       <w:r>
         <w:rPr>
           <w:rFonts w:asciiTheme="minorHAnsi" w:hAnsiTheme="minorHAnsi" w:cstheme="minorHAnsi"/>
+          <w:b/>
+          <w:bCs/>
           <w:color w:val="231F20"/>
         </w:rPr>
         <w:t>Nombre</w:t>
@@ -1163,6 +1165,8 @@
       <w:r>
         <w:rPr>
           <w:rFonts w:asciiTheme="minorHAnsi" w:hAnsiTheme="minorHAnsi" w:cstheme="minorHAnsi"/>
+          <w:b/>
+          <w:bCs/>
           <w:color w:val="231F20"/>
           <w:spacing w:val="-5"/>
         </w:rPr>
@@ -1171,6 +1175,8 @@
       <w:r>
         <w:rPr>
           <w:rFonts w:asciiTheme="minorHAnsi" w:hAnsiTheme="minorHAnsi" w:cstheme="minorHAnsi"/>
+          <w:b/>
+          <w:bCs/>
           <w:color w:val="231F20"/>
           <w:spacing w:val="-2"/>
         </w:rPr>
@@ -1985,6 +1991,7 @@
       <w:r>
         <w:rPr>
           <w:rFonts w:asciiTheme="minorHAnsi" w:eastAsia="Times New Roman" w:hAnsiTheme="minorHAnsi" w:cstheme="minorHAnsi"/>
+          <w:b/>
           <w:bCs/>
           <w:szCs w:val="36"/>
           <w:lang w:val="es-419" w:eastAsia="es-419"/>
@@ -2154,6 +2161,7 @@
         <w:autoSpaceDE/>
         <w:autoSpaceDN/>
         <w:spacing w:before="100" w:beforeAutospacing="1" w:after="100" w:afterAutospacing="1" w:line="276" w:lineRule="auto"/>
+        <w:jc w:val="both"/>
         <w:rPr>
           <w:rFonts w:asciiTheme="minorHAnsi" w:eastAsia="Times New Roman" w:hAnsiTheme="minorHAnsi" w:cstheme="minorHAnsi"/>
           <w:sz w:val="28"/>
@@ -2939,7 +2947,7 @@
           <w:szCs w:val="24"/>
           <w:lang w:val="es-419" w:eastAsia="es-419"/>
         </w:rPr>
-        <w:t>, el balance de clases y las variables disponibles.</w:t>
+        <w:t>, el balance de clases y las variables disponibles. Vafeiadis et al. (2015) llegaron a conclusiones similares al comparar árboles de decisión, SVM, redes bayesianas y k-vecinos más cercanos en este mismo problema, reforzando la conveniencia de comparar múltiples algoritmos antes de elegir un modelo final.</w:t>
       </w:r>
     </w:p>
     <w:p>
@@ -3031,6 +3039,7 @@
           <w:szCs w:val="24"/>
           <w:lang w:val="es-419" w:eastAsia="es-419"/>
         </w:rPr>
+        <w:lastRenderedPageBreak/>
         <w:t xml:space="preserve">Por otra parte, </w:t>
       </w:r>
       <w:proofErr w:type="spellStart"/>
@@ -3085,16 +3094,7 @@
           <w:szCs w:val="24"/>
           <w:lang w:val="es-419" w:eastAsia="es-419"/>
         </w:rPr>
-        <w:t xml:space="preserve">, desde la experimentación hasta el despliegue y monitoreo. Este antecedente es </w:t>
-      </w:r>
-      <w:r>
-        <w:rPr>
-          <w:rFonts w:asciiTheme="minorHAnsi" w:eastAsia="Times New Roman" w:hAnsiTheme="minorHAnsi" w:cstheme="minorHAnsi"/>
-          <w:szCs w:val="24"/>
-          <w:lang w:val="es-419" w:eastAsia="es-419"/>
-        </w:rPr>
-        <w:lastRenderedPageBreak/>
-        <w:t xml:space="preserve">importante para incorporar requisitos de mantenibilidad y </w:t>
+        <w:t xml:space="preserve">, desde la experimentación hasta el despliegue y monitoreo. Este antecedente es importante para incorporar requisitos de mantenibilidad y </w:t>
       </w:r>
       <w:proofErr w:type="spellStart"/>
       <w:r>
@@ -3592,6 +3592,7 @@
       <w:r>
         <w:rPr>
           <w:rFonts w:asciiTheme="minorHAnsi" w:eastAsia="Times New Roman" w:hAnsiTheme="minorHAnsi" w:cstheme="minorHAnsi"/>
+          <w:b/>
           <w:bCs/>
           <w:szCs w:val="36"/>
           <w:lang w:val="es-419" w:eastAsia="es-419"/>
@@ -3601,6 +3602,7 @@
       <w:r>
         <w:rPr>
           <w:rFonts w:asciiTheme="minorHAnsi" w:eastAsia="Times New Roman" w:hAnsiTheme="minorHAnsi" w:cstheme="minorHAnsi"/>
+          <w:b/>
           <w:bCs/>
           <w:szCs w:val="36"/>
           <w:lang w:val="es-419" w:eastAsia="es-419"/>
@@ -3731,7 +3733,14 @@
         <w:rPr>
           <w:rFonts w:asciiTheme="minorHAnsi" w:hAnsiTheme="minorHAnsi" w:cstheme="minorHAnsi"/>
         </w:rPr>
-        <w:t xml:space="preserve"> bajo métricas comunes.</w:t>
+        <w:t xml:space="preserve"> bajo métricas </w:t>
+      </w:r>
+      <w:r>
+        <w:rPr>
+          <w:rFonts w:asciiTheme="minorHAnsi" w:hAnsiTheme="minorHAnsi" w:cstheme="minorHAnsi"/>
+        </w:rPr>
+        <w:lastRenderedPageBreak/>
+        <w:t>comunes.</w:t>
       </w:r>
     </w:p>
     <w:p>
@@ -3778,14 +3787,7 @@
         <w:rPr>
           <w:rFonts w:asciiTheme="minorHAnsi" w:hAnsiTheme="minorHAnsi" w:cstheme="minorHAnsi"/>
         </w:rPr>
-        <w:t>, F1, ROC-AUC y PR-</w:t>
-      </w:r>
-      <w:r>
-        <w:rPr>
-          <w:rFonts w:asciiTheme="minorHAnsi" w:hAnsiTheme="minorHAnsi" w:cstheme="minorHAnsi"/>
-        </w:rPr>
-        <w:lastRenderedPageBreak/>
-        <w:t>AUC.</w:t>
+        <w:t>, F1, ROC-AUC y PR-AUC.</w:t>
       </w:r>
     </w:p>
     <w:p>
@@ -3893,7 +3895,7 @@
         <w:rPr>
           <w:rFonts w:asciiTheme="minorHAnsi" w:hAnsiTheme="minorHAnsi" w:cstheme="minorHAnsi"/>
         </w:rPr>
-        <w:t xml:space="preserve"> como modelos supervisados para datos tabulares. La comparación se amplió con tres redes: MLP superficial, MLP profunda y MLP residual.</w:t>
+        <w:t xml:space="preserve"> como modelos supervisados para datos tabulares. La comparación se amplió con tres redes: MLP superficial, MLP profunda y MLP residual. Las redes se entrenan mediante retropropagación del error (Rumelhart et al., 1986), y su comparación frente a modelos de árboles responde a evidencia reciente de que las redes neuronales no siempre superan a los métodos basados en árboles en datos tabulares (Borisov et al., 2024).</w:t>
       </w:r>
     </w:p>
     <w:p>
@@ -5523,17 +5525,8 @@
             <w:shd w:val="clear" w:color="auto" w:fill="FFF2CC"/>
           </w:tcPr>
           <w:p>
-            <w:pPr>
-              <w:rPr>
-                <w:rFonts w:asciiTheme="minorHAnsi" w:hAnsiTheme="minorHAnsi" w:cstheme="minorHAnsi"/>
-              </w:rPr>
-            </w:pPr>
-            <w:r>
-              <w:rPr>
-                <w:rFonts w:asciiTheme="minorHAnsi" w:hAnsiTheme="minorHAnsi" w:cstheme="minorHAnsi"/>
-                <w:sz w:val="14"/>
-              </w:rPr>
-              <w:t>Pendiente</w:t>
+            <w:r>
+              <w:t>Completado</w:t>
             </w:r>
           </w:p>
         </w:tc>
@@ -5659,17 +5652,8 @@
             <w:shd w:val="clear" w:color="auto" w:fill="FFF2CC"/>
           </w:tcPr>
           <w:p>
-            <w:pPr>
-              <w:rPr>
-                <w:rFonts w:asciiTheme="minorHAnsi" w:hAnsiTheme="minorHAnsi" w:cstheme="minorHAnsi"/>
-              </w:rPr>
-            </w:pPr>
-            <w:r>
-              <w:rPr>
-                <w:rFonts w:asciiTheme="minorHAnsi" w:hAnsiTheme="minorHAnsi" w:cstheme="minorHAnsi"/>
-                <w:sz w:val="14"/>
-              </w:rPr>
-              <w:t>Pendiente</w:t>
+            <w:r>
+              <w:t>Completado</w:t>
             </w:r>
           </w:p>
         </w:tc>
@@ -5804,17 +5788,8 @@
             <w:shd w:val="clear" w:color="auto" w:fill="FFF2CC"/>
           </w:tcPr>
           <w:p>
-            <w:pPr>
-              <w:rPr>
-                <w:rFonts w:asciiTheme="minorHAnsi" w:hAnsiTheme="minorHAnsi" w:cstheme="minorHAnsi"/>
-              </w:rPr>
-            </w:pPr>
-            <w:r>
-              <w:rPr>
-                <w:rFonts w:asciiTheme="minorHAnsi" w:hAnsiTheme="minorHAnsi" w:cstheme="minorHAnsi"/>
-                <w:sz w:val="14"/>
-              </w:rPr>
-              <w:t>Pendiente</w:t>
+            <w:r>
+              <w:t>Parcial</w:t>
             </w:r>
           </w:p>
         </w:tc>
@@ -6144,7 +6119,7 @@
           <w:szCs w:val="27"/>
           <w:lang w:val="es-419" w:eastAsia="es-419"/>
         </w:rPr>
-        <w:t>Análisis exploratorio de datos</w:t>
+        <w:t>4.1 Análisis exploratorio de datos</w:t>
       </w:r>
     </w:p>
     <w:p>
@@ -9500,6 +9475,7 @@
                 <w:rFonts w:asciiTheme="minorHAnsi" w:hAnsiTheme="minorHAnsi" w:cstheme="minorHAnsi"/>
               </w:rPr>
             </w:pPr>
+            <w:proofErr w:type="gramStart"/>
             <w:r>
               <w:rPr>
                 <w:rFonts w:asciiTheme="minorHAnsi" w:eastAsia="Calibri" w:hAnsiTheme="minorHAnsi" w:cstheme="minorHAnsi"/>
@@ -9507,6 +9483,7 @@
               </w:rPr>
               <w:t>Binaria objetivo</w:t>
             </w:r>
+            <w:proofErr w:type="gramEnd"/>
           </w:p>
         </w:tc>
         <w:tc>
@@ -11664,7 +11641,7 @@
         <w:rPr>
           <w:rFonts w:asciiTheme="minorHAnsi" w:eastAsia="Calibri" w:hAnsiTheme="minorHAnsi" w:cstheme="minorHAnsi"/>
         </w:rPr>
-        <w:t>Dado el desbalance de 8,79 a 1, se calcularon pesos de clase de 0,557 para la clase 0 y 4,895 para la clase 1. Las técnicas de balanceo se aplicaron únicamente al conjunto de entrenamiento; validación y prueba conservaron su distribución real.</w:t>
+        <w:t>Dado el desbalance de 8,79 a 1, se calcularon pesos de clase de 0,557 para la clase 0 y 4,895 para la clase 1. Las técnicas de balanceo se aplicaron únicamente al conjunto de entrenamiento; validación y prueba conservaron su distribución real. El desbalance de clases es un desafío ampliamente documentado en problemas de clasificación (He &amp; Garcia, 2009) y, específicamente, en la predicción de abandono de clientes (Burez &amp; Van den Poel, 2009).</w:t>
       </w:r>
     </w:p>
     <w:p>
@@ -13043,49 +13020,7 @@
         <w:rPr>
           <w:rFonts w:asciiTheme="minorHAnsi" w:hAnsiTheme="minorHAnsi" w:cstheme="minorHAnsi"/>
         </w:rPr>
-        <w:t xml:space="preserve">Figura 3. Histogramas de </w:t>
-      </w:r>
-      <w:proofErr w:type="spellStart"/>
-      <w:r>
-        <w:rPr>
-          <w:rFonts w:asciiTheme="minorHAnsi" w:hAnsiTheme="minorHAnsi" w:cstheme="minorHAnsi"/>
-        </w:rPr>
-        <w:t>csat_score</w:t>
-      </w:r>
-      <w:proofErr w:type="spellEnd"/>
-      <w:r>
-        <w:rPr>
-          <w:rFonts w:asciiTheme="minorHAnsi" w:hAnsiTheme="minorHAnsi" w:cstheme="minorHAnsi"/>
-        </w:rPr>
-        <w:t xml:space="preserve">, </w:t>
-      </w:r>
-      <w:proofErr w:type="spellStart"/>
-      <w:r>
-        <w:rPr>
-          <w:rFonts w:asciiTheme="minorHAnsi" w:hAnsiTheme="minorHAnsi" w:cstheme="minorHAnsi"/>
-        </w:rPr>
-        <w:t>tenure_months</w:t>
-      </w:r>
-      <w:proofErr w:type="spellEnd"/>
-      <w:r>
-        <w:rPr>
-          <w:rFonts w:asciiTheme="minorHAnsi" w:hAnsiTheme="minorHAnsi" w:cstheme="minorHAnsi"/>
-        </w:rPr>
-        <w:t xml:space="preserve">, </w:t>
-      </w:r>
-      <w:proofErr w:type="spellStart"/>
-      <w:r>
-        <w:rPr>
-          <w:rFonts w:asciiTheme="minorHAnsi" w:hAnsiTheme="minorHAnsi" w:cstheme="minorHAnsi"/>
-        </w:rPr>
-        <w:t>monthly_logins</w:t>
-      </w:r>
-      <w:proofErr w:type="spellEnd"/>
-      <w:r>
-        <w:rPr>
-          <w:rFonts w:asciiTheme="minorHAnsi" w:hAnsiTheme="minorHAnsi" w:cstheme="minorHAnsi"/>
-        </w:rPr>
-        <w:t xml:space="preserve"> y </w:t>
+        <w:t xml:space="preserve">Figura 3. Histogramas de csat_score, tenure_months, monthly_logins y </w:t>
       </w:r>
       <w:proofErr w:type="spellStart"/>
       <w:r>
@@ -13143,49 +13078,7 @@
         <w:rPr>
           <w:rFonts w:asciiTheme="minorHAnsi" w:hAnsiTheme="minorHAnsi" w:cstheme="minorHAnsi"/>
         </w:rPr>
-        <w:t xml:space="preserve">Los histogramas confirman que las distribuciones de clientes que permanecen y abandonan presentan una superposición importante, sin que ninguna variable numérica separe completamente a ambos grupos. No obstante, se observan desplazamientos visibles en </w:t>
-      </w:r>
-      <w:proofErr w:type="spellStart"/>
-      <w:r>
-        <w:rPr>
-          <w:rFonts w:asciiTheme="minorHAnsi" w:hAnsiTheme="minorHAnsi" w:cstheme="minorHAnsi"/>
-        </w:rPr>
-        <w:t>csat_score</w:t>
-      </w:r>
-      <w:proofErr w:type="spellEnd"/>
-      <w:r>
-        <w:rPr>
-          <w:rFonts w:asciiTheme="minorHAnsi" w:hAnsiTheme="minorHAnsi" w:cstheme="minorHAnsi"/>
-        </w:rPr>
-        <w:t xml:space="preserve">, </w:t>
-      </w:r>
-      <w:proofErr w:type="spellStart"/>
-      <w:r>
-        <w:rPr>
-          <w:rFonts w:asciiTheme="minorHAnsi" w:hAnsiTheme="minorHAnsi" w:cstheme="minorHAnsi"/>
-        </w:rPr>
-        <w:t>tenure_months</w:t>
-      </w:r>
-      <w:proofErr w:type="spellEnd"/>
-      <w:r>
-        <w:rPr>
-          <w:rFonts w:asciiTheme="minorHAnsi" w:hAnsiTheme="minorHAnsi" w:cstheme="minorHAnsi"/>
-        </w:rPr>
-        <w:t xml:space="preserve"> y </w:t>
-      </w:r>
-      <w:proofErr w:type="spellStart"/>
-      <w:r>
-        <w:rPr>
-          <w:rFonts w:asciiTheme="minorHAnsi" w:hAnsiTheme="minorHAnsi" w:cstheme="minorHAnsi"/>
-        </w:rPr>
-        <w:t>monthly_logins</w:t>
-      </w:r>
-      <w:proofErr w:type="spellEnd"/>
-      <w:r>
-        <w:rPr>
-          <w:rFonts w:asciiTheme="minorHAnsi" w:hAnsiTheme="minorHAnsi" w:cstheme="minorHAnsi"/>
-        </w:rPr>
-        <w:t xml:space="preserve"> hacia valores menores entre quienes abandonan, consistentes con las diferencias de medias reportadas en la Tabla 3. Estos desplazamientos son señales útiles, pero solo alcanzan valor predictivo al combinarse con otras características dentro de un modelo multivariable.</w:t>
+        <w:t>Los histogramas confirman que las distribuciones de clientes que permanecen y abandonan presentan una superposición importante, sin que ninguna variable numérica separe completamente a ambos grupos. No obstante, se observan desplazamientos visibles en csat_score, tenure_months y monthly_logins hacia valores menores entre quienes abandonan, consistentes con las diferencias de medias reportadas en la Tabla 4. Estos desplazamientos son señales útiles, pero solo alcanzan valor predictivo al combinarse con otras características dentro de un modelo multivariable.</w:t>
       </w:r>
     </w:p>
     <w:p>
@@ -13790,6 +13683,8 @@
     </w:p>
     <w:p>
       <w:pPr>
+        <w:spacing w:line="276" w:lineRule="auto"/>
+        <w:jc w:val="both"/>
         <w:rPr>
           <w:rFonts w:asciiTheme="minorHAnsi" w:hAnsiTheme="minorHAnsi" w:cstheme="minorHAnsi"/>
         </w:rPr>
@@ -17483,17 +17378,8 @@
             <w:shd w:val="clear" w:color="auto" w:fill="FFF2CC"/>
           </w:tcPr>
           <w:p>
-            <w:pPr>
-              <w:rPr>
-                <w:rFonts w:asciiTheme="minorHAnsi" w:hAnsiTheme="minorHAnsi" w:cstheme="minorHAnsi"/>
-              </w:rPr>
-            </w:pPr>
-            <w:r>
-              <w:rPr>
-                <w:rFonts w:asciiTheme="minorHAnsi" w:hAnsiTheme="minorHAnsi" w:cstheme="minorHAnsi"/>
-                <w:sz w:val="15"/>
-              </w:rPr>
-              <w:t>Pendiente</w:t>
+            <w:r>
+              <w:t>Completado</w:t>
             </w:r>
           </w:p>
         </w:tc>
@@ -17565,17 +17451,8 @@
             <w:shd w:val="clear" w:color="auto" w:fill="FFF2CC"/>
           </w:tcPr>
           <w:p>
-            <w:pPr>
-              <w:rPr>
-                <w:rFonts w:asciiTheme="minorHAnsi" w:hAnsiTheme="minorHAnsi" w:cstheme="minorHAnsi"/>
-              </w:rPr>
-            </w:pPr>
-            <w:r>
-              <w:rPr>
-                <w:rFonts w:asciiTheme="minorHAnsi" w:hAnsiTheme="minorHAnsi" w:cstheme="minorHAnsi"/>
-                <w:sz w:val="15"/>
-              </w:rPr>
-              <w:t>Pendiente</w:t>
+            <w:r>
+              <w:t>Completado</w:t>
             </w:r>
           </w:p>
         </w:tc>
@@ -17647,17 +17524,8 @@
             <w:shd w:val="clear" w:color="auto" w:fill="FFF2CC"/>
           </w:tcPr>
           <w:p>
-            <w:pPr>
-              <w:rPr>
-                <w:rFonts w:asciiTheme="minorHAnsi" w:hAnsiTheme="minorHAnsi" w:cstheme="minorHAnsi"/>
-              </w:rPr>
-            </w:pPr>
-            <w:r>
-              <w:rPr>
-                <w:rFonts w:asciiTheme="minorHAnsi" w:hAnsiTheme="minorHAnsi" w:cstheme="minorHAnsi"/>
-                <w:sz w:val="15"/>
-              </w:rPr>
-              <w:t>Pendiente</w:t>
+            <w:r>
+              <w:t>Completado</w:t>
             </w:r>
           </w:p>
         </w:tc>
@@ -17729,17 +17597,8 @@
             <w:shd w:val="clear" w:color="auto" w:fill="FFF2CC"/>
           </w:tcPr>
           <w:p>
-            <w:pPr>
-              <w:rPr>
-                <w:rFonts w:asciiTheme="minorHAnsi" w:hAnsiTheme="minorHAnsi" w:cstheme="minorHAnsi"/>
-              </w:rPr>
-            </w:pPr>
-            <w:r>
-              <w:rPr>
-                <w:rFonts w:asciiTheme="minorHAnsi" w:hAnsiTheme="minorHAnsi" w:cstheme="minorHAnsi"/>
-                <w:sz w:val="15"/>
-              </w:rPr>
-              <w:t>Pendiente</w:t>
+            <w:r>
+              <w:t>Completado</w:t>
             </w:r>
           </w:p>
         </w:tc>
@@ -18066,17 +17925,8 @@
             <w:shd w:val="clear" w:color="auto" w:fill="FFF2CC"/>
           </w:tcPr>
           <w:p>
-            <w:pPr>
-              <w:rPr>
-                <w:rFonts w:asciiTheme="minorHAnsi" w:hAnsiTheme="minorHAnsi" w:cstheme="minorHAnsi"/>
-              </w:rPr>
-            </w:pPr>
-            <w:r>
-              <w:rPr>
-                <w:rFonts w:asciiTheme="minorHAnsi" w:hAnsiTheme="minorHAnsi" w:cstheme="minorHAnsi"/>
-                <w:sz w:val="15"/>
-              </w:rPr>
-              <w:t>Pendiente</w:t>
+            <w:r>
+              <w:t>Completado</w:t>
             </w:r>
           </w:p>
         </w:tc>
@@ -18150,17 +18000,8 @@
             <w:shd w:val="clear" w:color="auto" w:fill="FFF2CC"/>
           </w:tcPr>
           <w:p>
-            <w:pPr>
-              <w:rPr>
-                <w:rFonts w:asciiTheme="minorHAnsi" w:hAnsiTheme="minorHAnsi" w:cstheme="minorHAnsi"/>
-              </w:rPr>
-            </w:pPr>
-            <w:r>
-              <w:rPr>
-                <w:rFonts w:asciiTheme="minorHAnsi" w:hAnsiTheme="minorHAnsi" w:cstheme="minorHAnsi"/>
-                <w:sz w:val="15"/>
-              </w:rPr>
-              <w:t>Pendiente</w:t>
+            <w:r>
+              <w:t>Completado</w:t>
             </w:r>
           </w:p>
         </w:tc>
@@ -18232,17 +18073,8 @@
             <w:shd w:val="clear" w:color="auto" w:fill="FFF2CC"/>
           </w:tcPr>
           <w:p>
-            <w:pPr>
-              <w:rPr>
-                <w:rFonts w:asciiTheme="minorHAnsi" w:hAnsiTheme="minorHAnsi" w:cstheme="minorHAnsi"/>
-              </w:rPr>
-            </w:pPr>
-            <w:r>
-              <w:rPr>
-                <w:rFonts w:asciiTheme="minorHAnsi" w:hAnsiTheme="minorHAnsi" w:cstheme="minorHAnsi"/>
-                <w:sz w:val="15"/>
-              </w:rPr>
-              <w:t>Pendiente</w:t>
+            <w:r>
+              <w:t>Completado</w:t>
             </w:r>
           </w:p>
         </w:tc>
@@ -18314,17 +18146,8 @@
             <w:shd w:val="clear" w:color="auto" w:fill="FFF2CC"/>
           </w:tcPr>
           <w:p>
-            <w:pPr>
-              <w:rPr>
-                <w:rFonts w:asciiTheme="minorHAnsi" w:hAnsiTheme="minorHAnsi" w:cstheme="minorHAnsi"/>
-              </w:rPr>
-            </w:pPr>
-            <w:r>
-              <w:rPr>
-                <w:rFonts w:asciiTheme="minorHAnsi" w:hAnsiTheme="minorHAnsi" w:cstheme="minorHAnsi"/>
-                <w:sz w:val="15"/>
-              </w:rPr>
-              <w:t>Parcial</w:t>
+            <w:r>
+              <w:t>Completado</w:t>
             </w:r>
           </w:p>
         </w:tc>
@@ -18480,17 +18303,8 @@
             <w:shd w:val="clear" w:color="auto" w:fill="FFF2CC"/>
           </w:tcPr>
           <w:p>
-            <w:pPr>
-              <w:rPr>
-                <w:rFonts w:asciiTheme="minorHAnsi" w:hAnsiTheme="minorHAnsi" w:cstheme="minorHAnsi"/>
-              </w:rPr>
-            </w:pPr>
-            <w:r>
-              <w:rPr>
-                <w:rFonts w:asciiTheme="minorHAnsi" w:hAnsiTheme="minorHAnsi" w:cstheme="minorHAnsi"/>
-                <w:sz w:val="15"/>
-              </w:rPr>
-              <w:t>Pendiente</w:t>
+            <w:r>
+              <w:t>Completado</w:t>
             </w:r>
           </w:p>
         </w:tc>
@@ -18742,17 +18556,8 @@
             <w:shd w:val="clear" w:color="auto" w:fill="FFF2CC"/>
           </w:tcPr>
           <w:p>
-            <w:pPr>
-              <w:rPr>
-                <w:rFonts w:asciiTheme="minorHAnsi" w:hAnsiTheme="minorHAnsi" w:cstheme="minorHAnsi"/>
-              </w:rPr>
-            </w:pPr>
-            <w:r>
-              <w:rPr>
-                <w:rFonts w:asciiTheme="minorHAnsi" w:hAnsiTheme="minorHAnsi" w:cstheme="minorHAnsi"/>
-                <w:sz w:val="15"/>
-              </w:rPr>
-              <w:t>Pendiente</w:t>
+            <w:r>
+              <w:t>Completado</w:t>
             </w:r>
           </w:p>
         </w:tc>
@@ -18824,17 +18629,8 @@
             <w:shd w:val="clear" w:color="auto" w:fill="FFF2CC"/>
           </w:tcPr>
           <w:p>
-            <w:pPr>
-              <w:rPr>
-                <w:rFonts w:asciiTheme="minorHAnsi" w:hAnsiTheme="minorHAnsi" w:cstheme="minorHAnsi"/>
-              </w:rPr>
-            </w:pPr>
-            <w:r>
-              <w:rPr>
-                <w:rFonts w:asciiTheme="minorHAnsi" w:hAnsiTheme="minorHAnsi" w:cstheme="minorHAnsi"/>
-                <w:sz w:val="15"/>
-              </w:rPr>
-              <w:t>Definido</w:t>
+            <w:r>
+              <w:t>Completado</w:t>
             </w:r>
           </w:p>
         </w:tc>
@@ -19053,6 +18849,7 @@
           <w:rFonts w:asciiTheme="minorHAnsi" w:hAnsiTheme="minorHAnsi" w:cstheme="minorHAnsi"/>
           <w:noProof/>
         </w:rPr>
+        <w:lastRenderedPageBreak/>
         <w:drawing>
           <wp:inline distT="0" distB="0" distL="0" distR="0" wp14:anchorId="00B46C2A" wp14:editId="24A62874">
             <wp:extent cx="5760720" cy="3171632"/>
@@ -19227,14 +19024,7 @@
         <w:rPr>
           <w:rFonts w:asciiTheme="minorHAnsi" w:hAnsiTheme="minorHAnsi" w:cstheme="minorHAnsi"/>
         </w:rPr>
-        <w:t xml:space="preserve"> (0,843), ROC-AUC (0,826) y PR-AUC (0,333). La diferencia de F1 entre ambos fue 0,010. Debido a que el proyecto </w:t>
-      </w:r>
-      <w:r>
-        <w:rPr>
-          <w:rFonts w:asciiTheme="minorHAnsi" w:hAnsiTheme="minorHAnsi" w:cstheme="minorHAnsi"/>
-        </w:rPr>
-        <w:lastRenderedPageBreak/>
-        <w:t xml:space="preserve">prioriza detectar clientes en riesgo, se seleccionó </w:t>
+        <w:t xml:space="preserve"> (0,843), ROC-AUC (0,826) y PR-AUC (0,333). La diferencia de F1 entre ambos fue 0,010. Debido a que el proyecto prioriza detectar clientes en riesgo, se seleccionó </w:t>
       </w:r>
       <w:proofErr w:type="spellStart"/>
       <w:r>
@@ -19394,7 +19184,78 @@
           <w:rFonts w:asciiTheme="minorHAnsi" w:hAnsiTheme="minorHAnsi" w:cstheme="minorHAnsi"/>
           <w:noProof/>
         </w:rPr>
+        <w:lastRenderedPageBreak/>
         <w:t xml:space="preserve"> </w:t>
+      </w:r>
+      <w:r>
+        <w:rPr>
+          <w:noProof/>
+        </w:rPr>
+        <w:drawing>
+          <wp:inline distT="0" distB="0" distL="0" distR="0" wp14:anchorId="18FC215A" wp14:editId="1B98406E">
+            <wp:extent cx="5486400" cy="3048000"/>
+            <wp:effectExtent l="0" t="0" r="0" b="0"/>
+            <wp:docPr id="1950181918" name="Picture 1950181918"/>
+            <wp:cNvGraphicFramePr>
+              <a:graphicFrameLocks xmlns:a="http://schemas.openxmlformats.org/drawingml/2006/main" noChangeAspect="1"/>
+            </wp:cNvGraphicFramePr>
+            <a:graphic xmlns:a="http://schemas.openxmlformats.org/drawingml/2006/main">
+              <a:graphicData uri="http://schemas.openxmlformats.org/drawingml/2006/picture">
+                <pic:pic xmlns:pic="http://schemas.openxmlformats.org/drawingml/2006/picture">
+                  <pic:nvPicPr>
+                    <pic:cNvPr id="0" name="image.png"/>
+                    <pic:cNvPicPr/>
+                  </pic:nvPicPr>
+                  <pic:blipFill>
+                    <a:blip r:embed="rId32"/>
+                    <a:stretch>
+                      <a:fillRect/>
+                    </a:stretch>
+                  </pic:blipFill>
+                  <pic:spPr>
+                    <a:xfrm>
+                      <a:off x="0" y="0"/>
+                      <a:ext cx="5486400" cy="3048000"/>
+                    </a:xfrm>
+                    <a:prstGeom prst="rect">
+                      <a:avLst/>
+                    </a:prstGeom>
+                  </pic:spPr>
+                </pic:pic>
+              </a:graphicData>
+            </a:graphic>
+          </wp:inline>
+        </w:drawing>
+      </w:r>
+    </w:p>
+    <w:p>
+      <w:pPr>
+        <w:spacing w:after="40"/>
+        <w:jc w:val="center"/>
+      </w:pPr>
+      <w:r>
+        <w:rPr>
+          <w:sz w:val="18"/>
+        </w:rPr>
+        <w:t>Figura 8. Búsqueda de hiperparámetros de XGBoost (valida</w:t>
+      </w:r>
+      <w:r>
+        <w:rPr>
+          <w:sz w:val="18"/>
+        </w:rPr>
+        <w:t>ción cruzada, top 15 configuraciones).</w:t>
+      </w:r>
+    </w:p>
+    <w:p>
+      <w:pPr>
+        <w:spacing w:after="120"/>
+        <w:jc w:val="center"/>
+      </w:pPr>
+      <w:r>
+        <w:rPr>
+          <w:sz w:val="17"/>
+        </w:rPr>
+        <w:t>Fuente: elaboración propia.</w:t>
       </w:r>
     </w:p>
     <w:p>
@@ -19544,23 +19405,7 @@
           <w:rFonts w:asciiTheme="minorHAnsi" w:hAnsiTheme="minorHAnsi" w:cstheme="minorHAnsi"/>
           <w:sz w:val="18"/>
         </w:rPr>
-        <w:t xml:space="preserve">Figura 12. Curva </w:t>
-      </w:r>
-      <w:proofErr w:type="spellStart"/>
-      <w:r>
-        <w:rPr>
-          <w:rFonts w:asciiTheme="minorHAnsi" w:hAnsiTheme="minorHAnsi" w:cstheme="minorHAnsi"/>
-          <w:sz w:val="18"/>
-        </w:rPr>
-        <w:t>precision-recall</w:t>
-      </w:r>
-      <w:proofErr w:type="spellEnd"/>
-      <w:r>
-        <w:rPr>
-          <w:rFonts w:asciiTheme="minorHAnsi" w:hAnsiTheme="minorHAnsi" w:cstheme="minorHAnsi"/>
-          <w:sz w:val="18"/>
-        </w:rPr>
-        <w:t xml:space="preserve"> del modelo refinado, con el umbral elegido y el umbral F1-máximo descartado.</w:t>
+        <w:t>Figura 9. Curva precision-recall del modelo refinado, con el umbral elegido y el umbral F1-máximo descartado.</w:t>
       </w:r>
     </w:p>
     <w:p>
@@ -19576,6 +19421,7 @@
           <w:rFonts w:asciiTheme="minorHAnsi" w:hAnsiTheme="minorHAnsi" w:cstheme="minorHAnsi"/>
           <w:sz w:val="17"/>
         </w:rPr>
+        <w:lastRenderedPageBreak/>
         <w:t>Fuente: elaboración propia.</w:t>
       </w:r>
     </w:p>
@@ -19609,8 +19455,7 @@
         <w:rPr>
           <w:rFonts w:asciiTheme="minorHAnsi" w:hAnsiTheme="minorHAnsi" w:cstheme="minorHAnsi"/>
         </w:rPr>
-        <w:lastRenderedPageBreak/>
-        <w:t>La Tabla 13 compara el efecto de cada etapa del refinamiento en validación.</w:t>
+        <w:t>La Tabla 10 compara el efecto de cada etapa del refinamiento en validación.</w:t>
       </w:r>
     </w:p>
     <w:p>
@@ -19626,23 +19471,7 @@
           <w:rFonts w:asciiTheme="minorHAnsi" w:hAnsiTheme="minorHAnsi" w:cstheme="minorHAnsi"/>
           <w:b/>
         </w:rPr>
-        <w:t xml:space="preserve">Tabla 13. Efecto del refinamiento de </w:t>
-      </w:r>
-      <w:proofErr w:type="spellStart"/>
-      <w:r>
-        <w:rPr>
-          <w:rFonts w:asciiTheme="minorHAnsi" w:hAnsiTheme="minorHAnsi" w:cstheme="minorHAnsi"/>
-          <w:b/>
-        </w:rPr>
-        <w:t>XGBoost</w:t>
-      </w:r>
-      <w:proofErr w:type="spellEnd"/>
-      <w:r>
-        <w:rPr>
-          <w:rFonts w:asciiTheme="minorHAnsi" w:hAnsiTheme="minorHAnsi" w:cstheme="minorHAnsi"/>
-          <w:b/>
-        </w:rPr>
-        <w:t xml:space="preserve"> + ROS en validación.</w:t>
+        <w:t>Tabla 10. Efecto del refinamiento de XGBoost + ROS en validación.</w:t>
       </w:r>
     </w:p>
     <w:tbl>
@@ -20256,23 +20085,7 @@
           <w:rFonts w:asciiTheme="minorHAnsi" w:hAnsiTheme="minorHAnsi" w:cstheme="minorHAnsi"/>
           <w:sz w:val="18"/>
         </w:rPr>
-        <w:t xml:space="preserve">Figura 13. Comparación visual entre el </w:t>
-      </w:r>
-      <w:proofErr w:type="spellStart"/>
-      <w:r>
-        <w:rPr>
-          <w:rFonts w:asciiTheme="minorHAnsi" w:hAnsiTheme="minorHAnsi" w:cstheme="minorHAnsi"/>
-          <w:sz w:val="18"/>
-        </w:rPr>
-        <w:t>baseline</w:t>
-      </w:r>
-      <w:proofErr w:type="spellEnd"/>
-      <w:r>
-        <w:rPr>
-          <w:rFonts w:asciiTheme="minorHAnsi" w:hAnsiTheme="minorHAnsi" w:cstheme="minorHAnsi"/>
-          <w:sz w:val="18"/>
-        </w:rPr>
-        <w:t xml:space="preserve"> y el modelo refinado en validación.</w:t>
+        <w:t>Figura 10. Comparación visual entre el baseline y el modelo refinado en validación.</w:t>
       </w:r>
     </w:p>
     <w:p>
@@ -20332,7 +20145,14 @@
         <w:rPr>
           <w:rFonts w:asciiTheme="minorHAnsi" w:hAnsiTheme="minorHAnsi" w:cstheme="minorHAnsi"/>
         </w:rPr>
-        <w:t xml:space="preserve">, ROC-AUC y PR-AUC) para demostrar el proceso de refinamiento de una arquitectura neuronal, sin reabrir la selección de </w:t>
+        <w:t>, ROC-</w:t>
+      </w:r>
+      <w:r>
+        <w:rPr>
+          <w:rFonts w:asciiTheme="minorHAnsi" w:hAnsiTheme="minorHAnsi" w:cstheme="minorHAnsi"/>
+        </w:rPr>
+        <w:lastRenderedPageBreak/>
+        <w:t xml:space="preserve">AUC y PR-AUC) para demostrar el proceso de refinamiento de una arquitectura neuronal, sin reabrir la selección de </w:t>
       </w:r>
       <w:proofErr w:type="spellStart"/>
       <w:r>
@@ -20402,14 +20222,7 @@
         <w:rPr>
           <w:rFonts w:asciiTheme="minorHAnsi" w:hAnsiTheme="minorHAnsi" w:cstheme="minorHAnsi"/>
         </w:rPr>
-        <w:t xml:space="preserve"> y un programador de </w:t>
-      </w:r>
-      <w:r>
-        <w:rPr>
-          <w:rFonts w:asciiTheme="minorHAnsi" w:hAnsiTheme="minorHAnsi" w:cstheme="minorHAnsi"/>
-        </w:rPr>
-        <w:lastRenderedPageBreak/>
-        <w:t xml:space="preserve">tasa de aprendizaje); (C) la arquitectura original con un </w:t>
+        <w:t xml:space="preserve"> y un programador de tasa de aprendizaje); (C) la arquitectura original con un </w:t>
       </w:r>
       <w:proofErr w:type="spellStart"/>
       <w:r>
@@ -20439,7 +20252,7 @@
           <w:rFonts w:asciiTheme="minorHAnsi" w:hAnsiTheme="minorHAnsi" w:cstheme="minorHAnsi"/>
           <w:b/>
         </w:rPr>
-        <w:t>Tabla 14. Comparación de configuraciones de la MLP profunda en validación.</w:t>
+        <w:t>Tabla 11. Comparación de configuraciones de la MLP profunda en validación.</w:t>
       </w:r>
     </w:p>
     <w:tbl>
@@ -21101,7 +20914,7 @@
           <w:rFonts w:asciiTheme="minorHAnsi" w:hAnsiTheme="minorHAnsi" w:cstheme="minorHAnsi"/>
           <w:sz w:val="18"/>
         </w:rPr>
-        <w:t>Figura 14. Evolución del ROC-AUC y PR-AUC de validación durante el entrenamiento de las configuraciones MLP.</w:t>
+        <w:t>Figura 11. Evolución del ROC-AUC y PR-AUC de validación durante el entrenamiento de las configuraciones MLP.</w:t>
       </w:r>
     </w:p>
     <w:p>
@@ -21140,6 +20953,7 @@
           <w:rFonts w:asciiTheme="minorHAnsi" w:hAnsiTheme="minorHAnsi" w:cstheme="minorHAnsi"/>
           <w:noProof/>
         </w:rPr>
+        <w:lastRenderedPageBreak/>
         <w:drawing>
           <wp:inline distT="0" distB="0" distL="0" distR="0" wp14:anchorId="402663BD" wp14:editId="1BCD284C">
             <wp:extent cx="5486400" cy="3048000"/>
@@ -21193,49 +21007,33 @@
           <w:sz w:val="18"/>
           <w:szCs w:val="18"/>
         </w:rPr>
-        <w:t>Figura 1</w:t>
-      </w:r>
-      <w:r>
+        <w:t>Figura 12. Curvas de entrenamiento (ROC-AUC y PR-AUC de validación) de las tres configuraciones de la MLP profunda.</w:t>
+      </w:r>
+    </w:p>
+    <w:p>
+      <w:pPr>
+        <w:spacing w:after="120"/>
+        <w:jc w:val="center"/>
         <w:rPr>
           <w:rFonts w:asciiTheme="minorHAnsi" w:hAnsiTheme="minorHAnsi" w:cstheme="minorHAnsi"/>
           <w:sz w:val="18"/>
           <w:szCs w:val="18"/>
         </w:rPr>
-        <w:t>5</w:t>
-      </w:r>
+      </w:pPr>
       <w:r>
         <w:rPr>
           <w:rFonts w:asciiTheme="minorHAnsi" w:hAnsiTheme="minorHAnsi" w:cstheme="minorHAnsi"/>
           <w:sz w:val="18"/>
           <w:szCs w:val="18"/>
         </w:rPr>
-        <w:t>. Curvas de entrenamiento (ROC-AUC y PR-AUC de validación) de las tres configuraciones de la MLP profunda.</w:t>
-      </w:r>
-    </w:p>
-    <w:p>
-      <w:pPr>
-        <w:spacing w:after="120"/>
+        <w:t>Fuente: elaboración propia.</w:t>
+      </w:r>
+    </w:p>
+    <w:p>
+      <w:pPr>
         <w:jc w:val="center"/>
         <w:rPr>
           <w:rFonts w:asciiTheme="minorHAnsi" w:hAnsiTheme="minorHAnsi" w:cstheme="minorHAnsi"/>
-          <w:sz w:val="18"/>
-          <w:szCs w:val="18"/>
-        </w:rPr>
-      </w:pPr>
-      <w:r>
-        <w:rPr>
-          <w:rFonts w:asciiTheme="minorHAnsi" w:hAnsiTheme="minorHAnsi" w:cstheme="minorHAnsi"/>
-          <w:sz w:val="18"/>
-          <w:szCs w:val="18"/>
-        </w:rPr>
-        <w:t>Fuente: elaboración propia.</w:t>
-      </w:r>
-    </w:p>
-    <w:p>
-      <w:pPr>
-        <w:jc w:val="center"/>
-        <w:rPr>
-          <w:rFonts w:asciiTheme="minorHAnsi" w:hAnsiTheme="minorHAnsi" w:cstheme="minorHAnsi"/>
         </w:rPr>
       </w:pPr>
       <w:r>
@@ -21243,7 +21041,6 @@
           <w:rFonts w:asciiTheme="minorHAnsi" w:hAnsiTheme="minorHAnsi" w:cstheme="minorHAnsi"/>
           <w:noProof/>
         </w:rPr>
-        <w:lastRenderedPageBreak/>
         <w:drawing>
           <wp:inline distT="0" distB="0" distL="0" distR="0" wp14:anchorId="54C4FE41" wp14:editId="6D0A9F0B">
             <wp:extent cx="6202680" cy="1938338"/>
@@ -21294,23 +21091,7 @@
           <w:rFonts w:asciiTheme="minorHAnsi" w:hAnsiTheme="minorHAnsi" w:cstheme="minorHAnsi"/>
           <w:sz w:val="18"/>
         </w:rPr>
-        <w:t>Figura 15. Pérdida de entrenamiento y validación por configuración (</w:t>
-      </w:r>
-      <w:proofErr w:type="spellStart"/>
-      <w:r>
-        <w:rPr>
-          <w:rFonts w:asciiTheme="minorHAnsi" w:hAnsiTheme="minorHAnsi" w:cstheme="minorHAnsi"/>
-          <w:sz w:val="18"/>
-        </w:rPr>
-        <w:t>BCEWithLogitsLoss</w:t>
-      </w:r>
-      <w:proofErr w:type="spellEnd"/>
-      <w:r>
-        <w:rPr>
-          <w:rFonts w:asciiTheme="minorHAnsi" w:hAnsiTheme="minorHAnsi" w:cstheme="minorHAnsi"/>
-          <w:sz w:val="18"/>
-        </w:rPr>
-        <w:t>), con la época óptima marcada.</w:t>
+        <w:t>Figura 13. Pérdida de entrenamiento y validación por configuración (BCEWithLogitsLoss), con la época óptima marcada.</w:t>
       </w:r>
     </w:p>
     <w:p>
@@ -21341,21 +21122,7 @@
         <w:rPr>
           <w:rFonts w:asciiTheme="minorHAnsi" w:hAnsiTheme="minorHAnsi" w:cstheme="minorHAnsi"/>
         </w:rPr>
-        <w:t xml:space="preserve">Las tres configuraciones muestran una brecha pequeña entre la pérdida de entrenamiento y de validación en su época óptima (por ejemplo, B alcanza 0,97 de pérdida de entrenamiento frente a 1,02 de validación en la época 11), lo que indica una convergencia razonable sin sobreajuste severo. Los valores absolutos de la configuración C son notoriamente más bajos que los de A y B (alrededor de 0,55 frente a 1,0), pero esto no refleja un mejor ajuste: se debe a que C usa un </w:t>
-      </w:r>
-      <w:proofErr w:type="spellStart"/>
-      <w:r>
-        <w:rPr>
-          <w:rFonts w:asciiTheme="minorHAnsi" w:hAnsiTheme="minorHAnsi" w:cstheme="minorHAnsi"/>
-        </w:rPr>
-        <w:t>pos_weight</w:t>
-      </w:r>
-      <w:proofErr w:type="spellEnd"/>
-      <w:r>
-        <w:rPr>
-          <w:rFonts w:asciiTheme="minorHAnsi" w:hAnsiTheme="minorHAnsi" w:cstheme="minorHAnsi"/>
-        </w:rPr>
-        <w:t xml:space="preserve"> menor, que reduce la magnitud de la pérdida independientemente de la calidad de las predicciones. Por eso los paneles se presentan por separado y la comparación entre configuraciones debe hacerse con las métricas de la Tabla 14, no con los valores de pérdida.</w:t>
+        <w:t>Las tres configuraciones muestran una brecha pequeña entre la pérdida de entrenamiento y de validación en su época óptima (por ejemplo, B alcanza 0,97 de pérdida de entrenamiento frente a 1,02 de validación en la época 11), lo que indica una convergencia razonable sin sobreajuste severo. Los valores absolutos de la configuración C son notoriamente más bajos que los de A y B (alrededor de 0,55 frente a 1,0), pero esto no refleja un mejor ajuste: se debe a que C usa un pos_weight menor, que reduce la magnitud de la pérdida independientemente de la calidad de las predicciones. Por eso los paneles se presentan por separado y la comparación entre configuraciones debe hacerse con las métricas de la Tabla 11, no con los valores de pérdida.</w:t>
       </w:r>
     </w:p>
     <w:p>
@@ -21370,6 +21137,7 @@
           <w:rFonts w:asciiTheme="minorHAnsi" w:hAnsiTheme="minorHAnsi" w:cstheme="minorHAnsi"/>
           <w:noProof/>
         </w:rPr>
+        <w:lastRenderedPageBreak/>
         <w:drawing>
           <wp:inline distT="0" distB="0" distL="0" distR="0" wp14:anchorId="288FAEE6" wp14:editId="2B356561">
             <wp:extent cx="5486400" cy="3048000"/>
@@ -21420,7 +21188,7 @@
           <w:rFonts w:asciiTheme="minorHAnsi" w:hAnsiTheme="minorHAnsi" w:cstheme="minorHAnsi"/>
           <w:sz w:val="18"/>
         </w:rPr>
-        <w:t>Figura 16. Comparación de las tres configuraciones de la MLP profunda en validación.</w:t>
+        <w:t>Figura 14. Comparación de las tres configuraciones de la MLP profunda en validación.</w:t>
       </w:r>
     </w:p>
     <w:p>
@@ -21575,14 +21343,7 @@
         <w:rPr>
           <w:rFonts w:asciiTheme="minorHAnsi" w:hAnsiTheme="minorHAnsi" w:cstheme="minorHAnsi"/>
         </w:rPr>
-        <w:t xml:space="preserve"> + </w:t>
-      </w:r>
-      <w:r>
-        <w:rPr>
-          <w:rFonts w:asciiTheme="minorHAnsi" w:hAnsiTheme="minorHAnsi" w:cstheme="minorHAnsi"/>
-        </w:rPr>
-        <w:lastRenderedPageBreak/>
-        <w:t>ROS sigue siendo el modelo final del proyecto.</w:t>
+        <w:t xml:space="preserve"> + ROS sigue siendo el modelo final del proyecto.</w:t>
       </w:r>
     </w:p>
     <w:p>
@@ -21743,7 +21504,7 @@
         <w:rPr>
           <w:rFonts w:asciiTheme="minorHAnsi" w:hAnsiTheme="minorHAnsi" w:cstheme="minorHAnsi"/>
         </w:rPr>
-        <w:t>.</w:t>
+        <w:t>. SMOTE genera ejemplos sintéticos interpolando entre vecinos de la clase minoritaria (Chawla et al., 2002), a diferencia de ROS, que duplica ejemplos existentes.</w:t>
       </w:r>
     </w:p>
     <w:p>
@@ -21761,7 +21522,7 @@
           <w:b/>
           <w:sz w:val="18"/>
         </w:rPr>
-        <w:t>Tabla 10. Efecto de las estrategias de balanceo por modelo en validación</w:t>
+        <w:t>Tabla 12. Efecto de las estrategias de balanceo por modelo en validación</w:t>
       </w:r>
     </w:p>
     <w:tbl>
@@ -22680,6 +22441,7 @@
                 <w:rFonts w:asciiTheme="minorHAnsi" w:hAnsiTheme="minorHAnsi" w:cstheme="minorHAnsi"/>
                 <w:sz w:val="14"/>
               </w:rPr>
+              <w:lastRenderedPageBreak/>
               <w:t>Random</w:t>
             </w:r>
             <w:proofErr w:type="spellEnd"/>
@@ -24035,7 +23797,7 @@
           <w:i/>
           <w:sz w:val="18"/>
         </w:rPr>
-        <w:t xml:space="preserve">Figura 8. Efecto de las estrategias de balanceo sobre </w:t>
+        <w:t xml:space="preserve">Figura 15. Efecto de las estrategias de balanceo sobre </w:t>
       </w:r>
       <w:proofErr w:type="spellStart"/>
       <w:r>
@@ -24217,7 +23979,6 @@
           <w:color w:val="1F4E79"/>
           <w:sz w:val="24"/>
         </w:rPr>
-        <w:lastRenderedPageBreak/>
         <w:t xml:space="preserve">4.7 Desarrollo </w:t>
       </w:r>
       <w:proofErr w:type="spellStart"/>
@@ -24271,66 +24032,120 @@
     </w:p>
     <w:p>
       <w:pPr>
-        <w:shd w:val="clear" w:color="auto" w:fill="FFF2CC"/>
-        <w:spacing w:before="60" w:after="180" w:line="276" w:lineRule="auto"/>
-        <w:ind w:left="216" w:right="216"/>
-        <w:rPr>
-          <w:rFonts w:asciiTheme="minorHAnsi" w:hAnsiTheme="minorHAnsi" w:cstheme="minorHAnsi"/>
-        </w:rPr>
-      </w:pPr>
-      <w:r>
-        <w:rPr>
-          <w:rFonts w:asciiTheme="minorHAnsi" w:hAnsiTheme="minorHAnsi" w:cstheme="minorHAnsi"/>
-          <w:b/>
-          <w:i/>
-          <w:color w:val="7F6000"/>
-          <w:sz w:val="20"/>
-        </w:rPr>
-        <w:t xml:space="preserve">PENDIENTE DE COMPLETAR. Responsable: Gabriel. Incorporar un diagrama y la descripción de la separación entre preprocesamiento, modelo, </w:t>
-      </w:r>
-      <w:proofErr w:type="spellStart"/>
-      <w:r>
-        <w:rPr>
-          <w:rFonts w:asciiTheme="minorHAnsi" w:hAnsiTheme="minorHAnsi" w:cstheme="minorHAnsi"/>
-          <w:b/>
-          <w:i/>
-          <w:color w:val="7F6000"/>
-          <w:sz w:val="20"/>
-        </w:rPr>
-        <w:t>backend</w:t>
-      </w:r>
-      <w:proofErr w:type="spellEnd"/>
-      <w:r>
-        <w:rPr>
-          <w:rFonts w:asciiTheme="minorHAnsi" w:hAnsiTheme="minorHAnsi" w:cstheme="minorHAnsi"/>
-          <w:b/>
-          <w:i/>
-          <w:color w:val="7F6000"/>
-          <w:sz w:val="20"/>
-        </w:rPr>
-        <w:t xml:space="preserve">, </w:t>
-      </w:r>
-      <w:proofErr w:type="spellStart"/>
-      <w:r>
-        <w:rPr>
-          <w:rFonts w:asciiTheme="minorHAnsi" w:hAnsiTheme="minorHAnsi" w:cstheme="minorHAnsi"/>
-          <w:b/>
-          <w:i/>
-          <w:color w:val="7F6000"/>
-          <w:sz w:val="20"/>
-        </w:rPr>
-        <w:t>frontend</w:t>
-      </w:r>
-      <w:proofErr w:type="spellEnd"/>
-      <w:r>
-        <w:rPr>
-          <w:rFonts w:asciiTheme="minorHAnsi" w:hAnsiTheme="minorHAnsi" w:cstheme="minorHAnsi"/>
-          <w:b/>
-          <w:i/>
-          <w:color w:val="7F6000"/>
-          <w:sz w:val="20"/>
-        </w:rPr>
-        <w:t xml:space="preserve"> y monitoreo, vinculándolos con los requisitos de escalabilidad y mantenibilidad.</w:t>
+        <w:spacing w:after="120" w:line="276" w:lineRule="auto"/>
+        <w:jc w:val="both"/>
+      </w:pPr>
+      <w:r>
+        <w:t xml:space="preserve">El prototipo se organiza en dos procesos independientes que se comunican exclusivamente por </w:t>
+      </w:r>
+      <w:r>
+        <w:t>HTTP: un backend en FastAPI (carpeta backend/) que concentra toda la lógica de predicción, y un frontend en Streamlit (frontend/streamlit_app.py) que solo se encarga de la interfaz — nunca importa el código del backend directamente, todo pasa por la API. L</w:t>
+      </w:r>
+      <w:r>
+        <w:t>a Figura 16 muestra las capas del sistema.</w:t>
+      </w:r>
+    </w:p>
+    <w:p>
+      <w:pPr>
+        <w:jc w:val="center"/>
+      </w:pPr>
+      <w:r>
+        <w:rPr>
+          <w:noProof/>
+        </w:rPr>
+        <w:lastRenderedPageBreak/>
+        <w:drawing>
+          <wp:inline distT="0" distB="0" distL="0" distR="0" wp14:anchorId="3AEC816C" wp14:editId="1E2DCE53">
+            <wp:extent cx="5486400" cy="3945276"/>
+            <wp:effectExtent l="0" t="0" r="0" b="0"/>
+            <wp:docPr id="1950181913" name="Picture 1950181913"/>
+            <wp:cNvGraphicFramePr>
+              <a:graphicFrameLocks xmlns:a="http://schemas.openxmlformats.org/drawingml/2006/main" noChangeAspect="1"/>
+            </wp:cNvGraphicFramePr>
+            <a:graphic xmlns:a="http://schemas.openxmlformats.org/drawingml/2006/main">
+              <a:graphicData uri="http://schemas.openxmlformats.org/drawingml/2006/picture">
+                <pic:pic xmlns:pic="http://schemas.openxmlformats.org/drawingml/2006/picture">
+                  <pic:nvPicPr>
+                    <pic:cNvPr id="0" name="13_01_arquitectura_sistema.png"/>
+                    <pic:cNvPicPr/>
+                  </pic:nvPicPr>
+                  <pic:blipFill>
+                    <a:blip r:embed="rId39"/>
+                    <a:stretch>
+                      <a:fillRect/>
+                    </a:stretch>
+                  </pic:blipFill>
+                  <pic:spPr>
+                    <a:xfrm>
+                      <a:off x="0" y="0"/>
+                      <a:ext cx="5486400" cy="3945276"/>
+                    </a:xfrm>
+                    <a:prstGeom prst="rect">
+                      <a:avLst/>
+                    </a:prstGeom>
+                  </pic:spPr>
+                </pic:pic>
+              </a:graphicData>
+            </a:graphic>
+          </wp:inline>
+        </w:drawing>
+      </w:r>
+    </w:p>
+    <w:p>
+      <w:pPr>
+        <w:spacing w:after="40"/>
+        <w:jc w:val="center"/>
+      </w:pPr>
+      <w:r>
+        <w:rPr>
+          <w:sz w:val="18"/>
+        </w:rPr>
+        <w:t>Figura 16. Arquitectura del sistema: separación entre frontend, backend, lógica de negocio y artefactos entrenados.</w:t>
+      </w:r>
+    </w:p>
+    <w:p>
+      <w:pPr>
+        <w:spacing w:after="120"/>
+        <w:jc w:val="center"/>
+      </w:pPr>
+      <w:r>
+        <w:rPr>
+          <w:sz w:val="17"/>
+        </w:rPr>
+        <w:t>Fuente: elaboración propia.</w:t>
+      </w:r>
+    </w:p>
+    <w:p>
+      <w:pPr>
+        <w:spacing w:after="120" w:line="276" w:lineRule="auto"/>
+        <w:jc w:val="both"/>
+      </w:pPr>
+      <w:r>
+        <w:t>Dentro del backend, schema.py define el esquema de las 30 variables</w:t>
+      </w:r>
+      <w:r>
+        <w:t xml:space="preserve"> de entrada; inference.py contiene la clase ChurnPredictor, que carga una sola vez el preprocesador, el modelo y el explicador SHAP al iniciar el servidor, y expone los métodos validate() y predict(); customer_lookup.py recupera clientes reales del conjunt</w:t>
+      </w:r>
+      <w:r>
+        <w:t>o de prueba (reproduciendo exactamente la partición de notebook/02_preprocesamiento.ipynb) para la ficha de cliente; monitoring.py registra cada predicción en un CSV, sin guardar las variables crudas del cliente; y api.py expone todo esto mediante seis rut</w:t>
+      </w:r>
+      <w:r>
+        <w:t>as (/schema, /health, /predict, /customers, /customers/{id}, /monitoring), sin contener lógica propia.</w:t>
+      </w:r>
+    </w:p>
+    <w:p>
+      <w:pPr>
+        <w:spacing w:after="120" w:line="276" w:lineRule="auto"/>
+        <w:jc w:val="both"/>
+      </w:pPr>
+      <w:r>
+        <w:t xml:space="preserve">Esta separación responde directamente a dos requisitos no funcionales del proyecto (Tabla 9, sección 4.4): escalabilidad ("separar </w:t>
+      </w:r>
+      <w:r>
+        <w:t>preprocesamiento, inferencia e interfaz") y mantenibilidad ("organizar código, notebooks y artefactos"). Al comunicarse solo por HTTP, el backend podría escalarse horizontalmente o servir a un cliente distinto sin modificar la lógica de predicción; y al es</w:t>
+      </w:r>
+      <w:r>
+        <w:t>tar dividido en módulos con una única responsabilidad cada uno, cada pieza se puede probar de forma aislada — así se construyeron los 30 tests automatizados descritos en la sección 4.7.2.</w:t>
       </w:r>
     </w:p>
     <w:p>
@@ -24370,22 +24185,125 @@
     </w:p>
     <w:p>
       <w:pPr>
-        <w:shd w:val="clear" w:color="auto" w:fill="FFF2CC"/>
-        <w:spacing w:before="60" w:after="180" w:line="276" w:lineRule="auto"/>
-        <w:ind w:left="216" w:right="216"/>
-        <w:rPr>
-          <w:rFonts w:asciiTheme="minorHAnsi" w:hAnsiTheme="minorHAnsi" w:cstheme="minorHAnsi"/>
-        </w:rPr>
-      </w:pPr>
-      <w:r>
-        <w:rPr>
-          <w:rFonts w:asciiTheme="minorHAnsi" w:hAnsiTheme="minorHAnsi" w:cstheme="minorHAnsi"/>
-          <w:b/>
-          <w:i/>
-          <w:color w:val="7F6000"/>
-          <w:sz w:val="20"/>
-        </w:rPr>
-        <w:t>PENDIENTE DE COMPLETAR. Responsable: Gabriel. Documentar carga de artefactos, validación de entradas, transformación de datos, cálculo de probabilidad, clasificación del riesgo, manejo de errores y pruebas realizadas.</w:t>
+        <w:spacing w:after="120" w:line="276" w:lineRule="auto"/>
+        <w:jc w:val="both"/>
+      </w:pPr>
+      <w:r>
+        <w:t>Carga de artefactos. Al iniciar, ChurnPr</w:t>
+      </w:r>
+      <w:r>
+        <w:t>edictor carga una sola vez el ColumnTransformer ajustado (artifacts/preprocesador.joblib), el modelo xgboost_</w:t>
+      </w:r>
+      <w:proofErr w:type="gramStart"/>
+      <w:r>
+        <w:t>refinado.joblib</w:t>
+      </w:r>
+      <w:proofErr w:type="gramEnd"/>
+      <w:r>
+        <w:t xml:space="preserve">, el umbral y las bandas de riesgo validados (models/config_umbral.json) y construye el explicador SHAP sobre un fondo de 100 filas </w:t>
+      </w:r>
+      <w:r>
+        <w:t>de entrenamiento — la misma receta de notebook/07_explicabilidad_shap.ipynb, incluyendo el mismo respaldo automático a espacio de margen cuando el modo probabilidad falla por los splits categóricos de XGBoost.</w:t>
+      </w:r>
+    </w:p>
+    <w:p>
+      <w:pPr>
+        <w:spacing w:after="120" w:line="276" w:lineRule="auto"/>
+        <w:jc w:val="both"/>
+      </w:pPr>
+      <w:r>
+        <w:t xml:space="preserve">Validación de entradas. El método </w:t>
+      </w:r>
+      <w:proofErr w:type="gramStart"/>
+      <w:r>
+        <w:t>validate(</w:t>
+      </w:r>
+      <w:proofErr w:type="gramEnd"/>
+      <w:r>
+        <w:t>) r</w:t>
+      </w:r>
+      <w:r>
+        <w:t xml:space="preserve">evisa que estén las 30 variables, que las numéricas sean castables a número y que las categóricas pertenezcan al conjunto de valores observados en el dataset, </w:t>
+      </w:r>
+      <w:r>
+        <w:lastRenderedPageBreak/>
+        <w:t>devolviendo mensajes de error en español pensados para mostrarse junto a cada campo del formulari</w:t>
+      </w:r>
+      <w:r>
+        <w:t>o. Por decisión de diseño, un valor numérico fuera del rango histórico no se rechaza — el modelo puede extrapolar razonablemente —, pero una categoría desconocida sí, porque el codificador la representaría en silencio como todo-ceros y degradaría la predic</w:t>
+      </w:r>
+      <w:r>
+        <w:t>ción sin avisar.</w:t>
+      </w:r>
+    </w:p>
+    <w:p>
+      <w:pPr>
+        <w:spacing w:after="120" w:line="276" w:lineRule="auto"/>
+        <w:jc w:val="both"/>
+      </w:pPr>
+      <w:r>
+        <w:t xml:space="preserve">Transformación y cálculo de probabilidad. </w:t>
+      </w:r>
+      <w:proofErr w:type="gramStart"/>
+      <w:r>
+        <w:t>predict(</w:t>
+      </w:r>
+      <w:proofErr w:type="gramEnd"/>
+      <w:r>
+        <w:t>) arma una fila con las 30 variables, la transforma con el mismo preprocesador usado en el entrenamiento y calcula la probabilidad con predict_proba(). Se verificó que este camino es idénti</w:t>
+      </w:r>
+      <w:r>
+        <w:t>co, bit a bit, al usado en los notebooks: para 20 clientes reales del conjunto de prueba, la probabilidad calculada por la API coincidió exactamente (diferencia 0,0) con la calculada cargando los mismos artefactos directamente, sin pasar por la aplicación.</w:t>
+      </w:r>
+    </w:p>
+    <w:p>
+      <w:pPr>
+        <w:spacing w:after="120" w:line="276" w:lineRule="auto"/>
+        <w:jc w:val="both"/>
+      </w:pPr>
+      <w:r>
+        <w:t>Clasificación del riesgo. La probabilidad se compara contra el umbral (0,56) y la banda baja (0,24) definidos en notebook/06_refinamiento_modelo.ipynb, asignando Bajo, Medio o Alto con la función pura assign_risk_</w:t>
+      </w:r>
+      <w:proofErr w:type="gramStart"/>
+      <w:r>
+        <w:t>band(</w:t>
+      </w:r>
+      <w:proofErr w:type="gramEnd"/>
+      <w:r>
+        <w:t>), probada de forma aislada con nueve</w:t>
+      </w:r>
+      <w:r>
+        <w:t xml:space="preserve"> casos, incluyendo los límites exactos 0,24 y 0,56.</w:t>
+      </w:r>
+    </w:p>
+    <w:p>
+      <w:pPr>
+        <w:spacing w:after="120" w:line="276" w:lineRule="auto"/>
+        <w:jc w:val="both"/>
+      </w:pPr>
+      <w:r>
+        <w:t>Manejo de errores. Una entrada inválida lanza un error con el detalle de qué campo falló, que la API traduce a un código 422 con el mensaje; un identificador de cliente inexistente en la ficha devuelve 40</w:t>
+      </w:r>
+      <w:r>
+        <w:t>4; y FastAPI valida automáticamente, antes de que el código propio se ejecute, que el cuerpo de la solicitud tenga las 30 variables con el tipo correcto.</w:t>
+      </w:r>
+    </w:p>
+    <w:p>
+      <w:pPr>
+        <w:spacing w:after="120" w:line="276" w:lineRule="auto"/>
+        <w:jc w:val="both"/>
+      </w:pPr>
+      <w:r>
+        <w:t>Pruebas realizadas. El backend cuenta con 43 pruebas automatizadas (pytest, sin mocks — los artefactos</w:t>
+      </w:r>
+      <w:r>
+        <w:t xml:space="preserve"> reales son rápidos de cargar): validación de entradas correctas e incorrectas (incluyendo el rechazo de valores objetivamente imposibles, ej. csat_score fuera de 1-5, y la advertencia para valores fuera del rango histórico), forma y consistencia de la pre</w:t>
+      </w:r>
+      <w:r>
+        <w:t>dicción, que ambas direcciones de SHAP aparezcan cuando corresponde y que la contribución de cada variable categórica se agregue correctamente sobre el valor real del cliente, el registro de monitoreo (éxitos y errores, incluyendo que nunca se filtren vari</w:t>
+      </w:r>
+      <w:r>
+        <w:t>ables crudas del cliente) y los seis endpoints de la API contra casos válidos e inválidos, usando el cliente de pruebas de FastAPI sin necesidad de levantar un servidor real.</w:t>
       </w:r>
     </w:p>
     <w:p>
@@ -24417,22 +24335,199 @@
     </w:p>
     <w:p>
       <w:pPr>
-        <w:shd w:val="clear" w:color="auto" w:fill="FFF2CC"/>
-        <w:spacing w:before="60" w:after="180" w:line="276" w:lineRule="auto"/>
-        <w:ind w:left="216" w:right="216"/>
-        <w:rPr>
-          <w:rFonts w:asciiTheme="minorHAnsi" w:hAnsiTheme="minorHAnsi" w:cstheme="minorHAnsi"/>
-        </w:rPr>
-      </w:pPr>
-      <w:r>
-        <w:rPr>
-          <w:rFonts w:asciiTheme="minorHAnsi" w:hAnsiTheme="minorHAnsi" w:cstheme="minorHAnsi"/>
-          <w:b/>
-          <w:i/>
-          <w:color w:val="7F6000"/>
-          <w:sz w:val="20"/>
-        </w:rPr>
-        <w:t>PENDIENTE DE COMPLETAR. Responsable: Gabriel. Documentar la interfaz implementada, el flujo de uso, las decisiones de usabilidad y capturas de pantalla del ingreso de datos y del resultado.</w:t>
+        <w:spacing w:after="120" w:line="276" w:lineRule="auto"/>
+        <w:jc w:val="both"/>
+      </w:pPr>
+      <w:r>
+        <w:t>La interfaz (frontend/streamlit_app.py) tiene cuatro pestañas: Pre</w:t>
+      </w:r>
+      <w:r>
+        <w:t>dicción individual, Ficha de cliente, Explicabilidad global y Monitoreo.</w:t>
+      </w:r>
+    </w:p>
+    <w:p>
+      <w:pPr>
+        <w:spacing w:after="120" w:line="276" w:lineRule="auto"/>
+        <w:jc w:val="both"/>
+      </w:pPr>
+      <w:r>
+        <w:t xml:space="preserve">Flujo de uso. En "Predicción individual", el usuario completa un formulario con las 30 variables, agrupadas en cinco secciones (Demografía, Contrato y uso, Facturación, </w:t>
+      </w:r>
+      <w:r>
+        <w:t xml:space="preserve">Soporte, Interacción y marketing) con valores por defecto tomados de la mediana o la moda de cada variable (Figura 17). En "Ficha de cliente", en cambio, se elige un cliente real del conjunto de prueba por su identificador. En ambos casos, el resultado se </w:t>
+      </w:r>
+      <w:r>
+        <w:t xml:space="preserve">abre en una ventana modal (Figura 18) — probabilidad, banda de riesgo, una barra que compara la probabilidad contra el umbral, los factores que más influyeron y el gráfico técnico de SHAP —, y al cerrarla la pantalla vuelve al formulario o al buscador con </w:t>
+      </w:r>
+      <w:r>
+        <w:t>los datos ya ingresados, sin tener que completarlos de nuevo.</w:t>
+      </w:r>
+    </w:p>
+    <w:p>
+      <w:pPr>
+        <w:jc w:val="center"/>
+      </w:pPr>
+      <w:r>
+        <w:rPr>
+          <w:noProof/>
+        </w:rPr>
+        <w:lastRenderedPageBreak/>
+        <w:drawing>
+          <wp:inline distT="0" distB="0" distL="0" distR="0" wp14:anchorId="5E510192" wp14:editId="64B61973">
+            <wp:extent cx="5486400" cy="3657600"/>
+            <wp:effectExtent l="0" t="0" r="0" b="0"/>
+            <wp:docPr id="1950181914" name="Picture 1950181914"/>
+            <wp:cNvGraphicFramePr>
+              <a:graphicFrameLocks xmlns:a="http://schemas.openxmlformats.org/drawingml/2006/main" noChangeAspect="1"/>
+            </wp:cNvGraphicFramePr>
+            <a:graphic xmlns:a="http://schemas.openxmlformats.org/drawingml/2006/main">
+              <a:graphicData uri="http://schemas.openxmlformats.org/drawingml/2006/picture">
+                <pic:pic xmlns:pic="http://schemas.openxmlformats.org/drawingml/2006/picture">
+                  <pic:nvPicPr>
+                    <pic:cNvPr id="0" name="13_02_formulario_prediccion.png"/>
+                    <pic:cNvPicPr/>
+                  </pic:nvPicPr>
+                  <pic:blipFill>
+                    <a:blip r:embed="rId40"/>
+                    <a:stretch>
+                      <a:fillRect/>
+                    </a:stretch>
+                  </pic:blipFill>
+                  <pic:spPr>
+                    <a:xfrm>
+                      <a:off x="0" y="0"/>
+                      <a:ext cx="5486400" cy="3657600"/>
+                    </a:xfrm>
+                    <a:prstGeom prst="rect">
+                      <a:avLst/>
+                    </a:prstGeom>
+                  </pic:spPr>
+                </pic:pic>
+              </a:graphicData>
+            </a:graphic>
+          </wp:inline>
+        </w:drawing>
+      </w:r>
+    </w:p>
+    <w:p>
+      <w:pPr>
+        <w:spacing w:after="40"/>
+        <w:jc w:val="center"/>
+      </w:pPr>
+      <w:r>
+        <w:rPr>
+          <w:sz w:val="18"/>
+        </w:rPr>
+        <w:t>Figura 17. Formulario de ingreso de datos de un cliente nuevo, agrupado por secciones.</w:t>
+      </w:r>
+    </w:p>
+    <w:p>
+      <w:pPr>
+        <w:spacing w:after="120"/>
+        <w:jc w:val="center"/>
+      </w:pPr>
+      <w:r>
+        <w:rPr>
+          <w:sz w:val="17"/>
+        </w:rPr>
+        <w:t>Fuente: elaboración propia.</w:t>
+      </w:r>
+    </w:p>
+    <w:p>
+      <w:pPr>
+        <w:jc w:val="center"/>
+      </w:pPr>
+      <w:r>
+        <w:rPr>
+          <w:noProof/>
+        </w:rPr>
+        <w:drawing>
+          <wp:inline distT="0" distB="0" distL="0" distR="0" wp14:anchorId="38FB41B2" wp14:editId="1A14193E">
+            <wp:extent cx="5486400" cy="3657600"/>
+            <wp:effectExtent l="0" t="0" r="0" b="0"/>
+            <wp:docPr id="1950181915" name="Picture 1950181915"/>
+            <wp:cNvGraphicFramePr>
+              <a:graphicFrameLocks xmlns:a="http://schemas.openxmlformats.org/drawingml/2006/main" noChangeAspect="1"/>
+            </wp:cNvGraphicFramePr>
+            <a:graphic xmlns:a="http://schemas.openxmlformats.org/drawingml/2006/main">
+              <a:graphicData uri="http://schemas.openxmlformats.org/drawingml/2006/picture">
+                <pic:pic xmlns:pic="http://schemas.openxmlformats.org/drawingml/2006/picture">
+                  <pic:nvPicPr>
+                    <pic:cNvPr id="0" name="13_03_resultado_modal.png"/>
+                    <pic:cNvPicPr/>
+                  </pic:nvPicPr>
+                  <pic:blipFill>
+                    <a:blip r:embed="rId41"/>
+                    <a:stretch>
+                      <a:fillRect/>
+                    </a:stretch>
+                  </pic:blipFill>
+                  <pic:spPr>
+                    <a:xfrm>
+                      <a:off x="0" y="0"/>
+                      <a:ext cx="5486400" cy="3657600"/>
+                    </a:xfrm>
+                    <a:prstGeom prst="rect">
+                      <a:avLst/>
+                    </a:prstGeom>
+                  </pic:spPr>
+                </pic:pic>
+              </a:graphicData>
+            </a:graphic>
+          </wp:inline>
+        </w:drawing>
+      </w:r>
+    </w:p>
+    <w:p>
+      <w:pPr>
+        <w:spacing w:after="40"/>
+        <w:jc w:val="center"/>
+      </w:pPr>
+      <w:r>
+        <w:rPr>
+          <w:sz w:val="18"/>
+        </w:rPr>
+        <w:t xml:space="preserve">Figura 18. Resultado de la predicción en la ventana modal, con la barra de </w:t>
+      </w:r>
+      <w:r>
+        <w:rPr>
+          <w:sz w:val="18"/>
+        </w:rPr>
+        <w:t>probabilidad y los factores por dirección.</w:t>
+      </w:r>
+    </w:p>
+    <w:p>
+      <w:pPr>
+        <w:spacing w:after="120"/>
+        <w:jc w:val="center"/>
+      </w:pPr>
+      <w:r>
+        <w:rPr>
+          <w:sz w:val="17"/>
+        </w:rPr>
+        <w:t>Fuente: elaboración propia.</w:t>
+      </w:r>
+    </w:p>
+    <w:p>
+      <w:pPr>
+        <w:spacing w:after="120" w:line="276" w:lineRule="auto"/>
+        <w:jc w:val="both"/>
+      </w:pPr>
+      <w:r>
+        <w:t>Decisiones de usabilidad. Las 30 variables se muestran con nombres en español legibles para un usuario de negocio (por ejemplo, "Antigüedad (meses)" en vez del nombre técnico de columna</w:t>
+      </w:r>
+      <w:r>
+        <w:t xml:space="preserve">), no con los nombres </w:t>
+      </w:r>
+      <w:r>
+        <w:lastRenderedPageBreak/>
+        <w:t>técnicos; las variables categóricas también traducen sus valores (por ejemplo, "Alemania" en vez de "Germany"); los campos con un límite real (puntaje de satisfacción de 1 a 5, NPS entre -100 y 100, tasas entre 0 % y 100 %) no permite</w:t>
+      </w:r>
+      <w:r>
+        <w:t>n ingresar valores fuera de ese rango, y las variables que son enteras en el dataset se muestran sin decimales; el resultado aparece en un modal para mantener una sola función clara por pantalla; y la app ocupa un 70 % del ancho en pantallas de escritorio,</w:t>
+      </w:r>
+      <w:r>
+        <w:t xml:space="preserve"> pero usa casi todo el ancho disponible, con márgenes pequeños, en dispositivos móviles.</w:t>
       </w:r>
     </w:p>
     <w:p>
@@ -24472,44 +24567,224 @@
     </w:p>
     <w:p>
       <w:pPr>
-        <w:shd w:val="clear" w:color="auto" w:fill="FFF2CC"/>
-        <w:spacing w:before="60" w:after="180" w:line="276" w:lineRule="auto"/>
-        <w:ind w:left="216" w:right="216"/>
-        <w:rPr>
-          <w:rFonts w:asciiTheme="minorHAnsi" w:hAnsiTheme="minorHAnsi" w:cstheme="minorHAnsi"/>
-        </w:rPr>
-      </w:pPr>
-      <w:r>
-        <w:rPr>
-          <w:rFonts w:asciiTheme="minorHAnsi" w:hAnsiTheme="minorHAnsi" w:cstheme="minorHAnsi"/>
-          <w:b/>
-          <w:i/>
-          <w:color w:val="7F6000"/>
-          <w:sz w:val="20"/>
-        </w:rPr>
-        <w:t>PENDIENTE DE COMPLETAR. Responsables: Diego (</w:t>
-      </w:r>
-      <w:proofErr w:type="spellStart"/>
-      <w:r>
-        <w:rPr>
-          <w:rFonts w:asciiTheme="minorHAnsi" w:hAnsiTheme="minorHAnsi" w:cstheme="minorHAnsi"/>
-          <w:b/>
-          <w:i/>
-          <w:color w:val="7F6000"/>
-          <w:sz w:val="20"/>
-        </w:rPr>
-        <w:t>explicabilidad</w:t>
-      </w:r>
-      <w:proofErr w:type="spellEnd"/>
-      <w:r>
-        <w:rPr>
-          <w:rFonts w:asciiTheme="minorHAnsi" w:hAnsiTheme="minorHAnsi" w:cstheme="minorHAnsi"/>
-          <w:b/>
-          <w:i/>
-          <w:color w:val="7F6000"/>
-          <w:sz w:val="20"/>
-        </w:rPr>
-        <w:t>) y Gabriel (monitoreo). Explicar cómo se presenta SHAP al usuario y cómo se registran volumen, probabilidades, niveles de riesgo, errores y tiempo de respuesta sin almacenar información sensible.</w:t>
+        <w:spacing w:after="120" w:line="276" w:lineRule="auto"/>
+        <w:jc w:val="both"/>
+      </w:pPr>
+      <w:r>
+        <w:t>Presentación de SHAP al usuario. Mostrar solo el gráfico técnico de SHAP —como hace notebook/07_explicabilidad_shap.ipynb— no es sufic</w:t>
+      </w:r>
+      <w:r>
+        <w:t>iente para un usuario de negocio, así que la app lo complementa con lenguaje simple en tres partes: una oración que compara la probabilidad estimada contra el umbral y explica por qué el cliente quedó en esa banda; dos listas separadas —factores que aument</w:t>
+      </w:r>
+      <w:r>
+        <w:t>aron el riesgo y factores que lo redujeron—, cada una con el valor real de la variable y su unidad (por ejemplo, "Fallos de pago: 1", no un vago "nivel alto"); y una oración de síntesis que nombra los factores concretos de cada lado y cuál pesó más, constr</w:t>
+      </w:r>
+      <w:r>
+        <w:t xml:space="preserve">uida a partir de las mismas contribuciones de SHAP que ya se muestran, sin agregar ninguna regla o causa inventada (Figura 18). El gráfico técnico sigue disponible debajo para quien quiera el detalle completo, y toda la sección cierra con la aclaración de </w:t>
+      </w:r>
+      <w:r>
+        <w:t>que estas son asociaciones aprendidas por el modelo, no relaciones causales. El backend selecciona hasta tres factores que aumentan y tres que reducen el riesgo por separado —no solo los cinco de mayor magnitud en conjunto—, para que el usuario siempre vea</w:t>
+      </w:r>
+      <w:r>
+        <w:t xml:space="preserve"> ambos lados y no solo el que domina en magnitud bruta.</w:t>
+      </w:r>
+    </w:p>
+    <w:p>
+      <w:pPr>
+        <w:spacing w:after="120" w:line="276" w:lineRule="auto"/>
+        <w:jc w:val="both"/>
+      </w:pPr>
+      <w:r>
+        <w:t>La pestaña "Explicabilidad global" (Figura 19) complementa la explicación local con la importancia global ya calculada en notebook/07_explicabilidad_shap.ipynb —no se recalcula en la app—, también con</w:t>
+      </w:r>
+      <w:r>
+        <w:t xml:space="preserve"> nombres de variable legibles.</w:t>
+      </w:r>
+    </w:p>
+    <w:p>
+      <w:pPr>
+        <w:jc w:val="center"/>
+      </w:pPr>
+      <w:r>
+        <w:rPr>
+          <w:noProof/>
+        </w:rPr>
+        <w:drawing>
+          <wp:inline distT="0" distB="0" distL="0" distR="0" wp14:anchorId="10190F42" wp14:editId="2C6AFF24">
+            <wp:extent cx="5486400" cy="3429000"/>
+            <wp:effectExtent l="0" t="0" r="0" b="0"/>
+            <wp:docPr id="1950181916" name="Picture 1950181916"/>
+            <wp:cNvGraphicFramePr>
+              <a:graphicFrameLocks xmlns:a="http://schemas.openxmlformats.org/drawingml/2006/main" noChangeAspect="1"/>
+            </wp:cNvGraphicFramePr>
+            <a:graphic xmlns:a="http://schemas.openxmlformats.org/drawingml/2006/main">
+              <a:graphicData uri="http://schemas.openxmlformats.org/drawingml/2006/picture">
+                <pic:pic xmlns:pic="http://schemas.openxmlformats.org/drawingml/2006/picture">
+                  <pic:nvPicPr>
+                    <pic:cNvPr id="0" name="13_05_explicabilidad_global.png"/>
+                    <pic:cNvPicPr/>
+                  </pic:nvPicPr>
+                  <pic:blipFill>
+                    <a:blip r:embed="rId42"/>
+                    <a:stretch>
+                      <a:fillRect/>
+                    </a:stretch>
+                  </pic:blipFill>
+                  <pic:spPr>
+                    <a:xfrm>
+                      <a:off x="0" y="0"/>
+                      <a:ext cx="5486400" cy="3429000"/>
+                    </a:xfrm>
+                    <a:prstGeom prst="rect">
+                      <a:avLst/>
+                    </a:prstGeom>
+                  </pic:spPr>
+                </pic:pic>
+              </a:graphicData>
+            </a:graphic>
+          </wp:inline>
+        </w:drawing>
+      </w:r>
+    </w:p>
+    <w:p>
+      <w:pPr>
+        <w:spacing w:after="40"/>
+        <w:jc w:val="center"/>
+      </w:pPr>
+      <w:r>
+        <w:rPr>
+          <w:sz w:val="18"/>
+        </w:rPr>
+        <w:t>Figura 19. Importancia global de variables en la pestaña Explicabilidad global.</w:t>
+      </w:r>
+    </w:p>
+    <w:p>
+      <w:pPr>
+        <w:spacing w:after="120"/>
+        <w:jc w:val="center"/>
+      </w:pPr>
+      <w:r>
+        <w:rPr>
+          <w:sz w:val="17"/>
+        </w:rPr>
+        <w:t>Fuente: elaboración propia.</w:t>
+      </w:r>
+    </w:p>
+    <w:p>
+      <w:pPr>
+        <w:spacing w:after="120" w:line="276" w:lineRule="auto"/>
+        <w:jc w:val="both"/>
+      </w:pPr>
+      <w:r>
+        <w:t xml:space="preserve">Registro de monitoreo. Cada predicción —tanto desde el formulario como desde la ficha de cliente— </w:t>
+      </w:r>
+      <w:r>
+        <w:lastRenderedPageBreak/>
+        <w:t>registra un event</w:t>
+      </w:r>
+      <w:r>
+        <w:t>o en monitoring/registro_predicciones.csv (ignorado por git) mediante monitoring.log_</w:t>
+      </w:r>
+      <w:proofErr w:type="gramStart"/>
+      <w:r>
+        <w:t>event(</w:t>
+      </w:r>
+      <w:proofErr w:type="gramEnd"/>
+      <w:r>
+        <w:t>): fecha y hora, origen (formulario o ficha de cliente), probabilidad, banda de riesgo, umbral usado y tiempo de respuesta. Deliberadamente no se registra ninguna va</w:t>
+      </w:r>
+      <w:r>
+        <w:t xml:space="preserve">riable cruda del cliente; esto está cubierto por una prueba automatizada que falla si alguna columna del dataset aparece entre las columnas guardadas. La pestaña "Monitoreo" (Figura 20) lee estos eventos a través de GET /monitoring y muestra el volumen de </w:t>
+      </w:r>
+      <w:r>
+        <w:t>predicciones, el tiempo de respuesta promedio, el porcentaje en banda Alto, la distribución por banda de riesgo y el detalle de cada evento, con la fecha convertida a hora de Chile y en formato día/mes/año.</w:t>
+      </w:r>
+    </w:p>
+    <w:p>
+      <w:pPr>
+        <w:jc w:val="center"/>
+      </w:pPr>
+      <w:r>
+        <w:rPr>
+          <w:noProof/>
+        </w:rPr>
+        <w:drawing>
+          <wp:inline distT="0" distB="0" distL="0" distR="0" wp14:anchorId="1FCAC958" wp14:editId="419AF076">
+            <wp:extent cx="5486400" cy="3657600"/>
+            <wp:effectExtent l="0" t="0" r="0" b="0"/>
+            <wp:docPr id="1950181917" name="Picture 1950181917"/>
+            <wp:cNvGraphicFramePr>
+              <a:graphicFrameLocks xmlns:a="http://schemas.openxmlformats.org/drawingml/2006/main" noChangeAspect="1"/>
+            </wp:cNvGraphicFramePr>
+            <a:graphic xmlns:a="http://schemas.openxmlformats.org/drawingml/2006/main">
+              <a:graphicData uri="http://schemas.openxmlformats.org/drawingml/2006/picture">
+                <pic:pic xmlns:pic="http://schemas.openxmlformats.org/drawingml/2006/picture">
+                  <pic:nvPicPr>
+                    <pic:cNvPr id="0" name="13_04_monitoreo.png"/>
+                    <pic:cNvPicPr/>
+                  </pic:nvPicPr>
+                  <pic:blipFill>
+                    <a:blip r:embed="rId43"/>
+                    <a:stretch>
+                      <a:fillRect/>
+                    </a:stretch>
+                  </pic:blipFill>
+                  <pic:spPr>
+                    <a:xfrm>
+                      <a:off x="0" y="0"/>
+                      <a:ext cx="5486400" cy="3657600"/>
+                    </a:xfrm>
+                    <a:prstGeom prst="rect">
+                      <a:avLst/>
+                    </a:prstGeom>
+                  </pic:spPr>
+                </pic:pic>
+              </a:graphicData>
+            </a:graphic>
+          </wp:inline>
+        </w:drawing>
+      </w:r>
+    </w:p>
+    <w:p>
+      <w:pPr>
+        <w:spacing w:after="40"/>
+        <w:jc w:val="center"/>
+      </w:pPr>
+      <w:r>
+        <w:rPr>
+          <w:sz w:val="18"/>
+        </w:rPr>
+        <w:t xml:space="preserve">Figura 20. Pestaña de monitoreo, con actividad </w:t>
+      </w:r>
+      <w:r>
+        <w:rPr>
+          <w:sz w:val="18"/>
+        </w:rPr>
+        <w:t>de la aplicación y desempeño validado del modelo.</w:t>
+      </w:r>
+    </w:p>
+    <w:p>
+      <w:pPr>
+        <w:spacing w:after="120"/>
+        <w:jc w:val="center"/>
+      </w:pPr>
+      <w:r>
+        <w:rPr>
+          <w:sz w:val="17"/>
+        </w:rPr>
+        <w:t>Fuente: elaboración propia.</w:t>
+      </w:r>
+    </w:p>
+    <w:p>
+      <w:pPr>
+        <w:spacing w:after="120" w:line="276" w:lineRule="auto"/>
+        <w:jc w:val="both"/>
+      </w:pPr>
+      <w:r>
+        <w:t>Debajo, por separado y claramente rotulado, se muestran las métricas de desempeño ya validadas en el conjunto de prueba (notebook/06_refinamiento_modelo.ipynb). Se mantienen apar</w:t>
+      </w:r>
+      <w:r>
+        <w:t>te a propósito: todavía no existe churn real posterior para los clientes que se ingresan por la app, así que mezclar ambas fuentes habría sido engañoso.</w:t>
       </w:r>
     </w:p>
     <w:p>
@@ -24545,7 +24820,7 @@
           <w:b/>
           <w:sz w:val="18"/>
         </w:rPr>
-        <w:t>Tabla 11. Comparación de tres modelos de ML y tres arquitecturas de DL en validación</w:t>
+        <w:t>Tabla 13. Comparación de tres modelos de ML y tres arquitecturas de DL en validación</w:t>
       </w:r>
     </w:p>
     <w:tbl>
@@ -25672,7 +25947,7 @@
                     <pic:cNvPicPr/>
                   </pic:nvPicPr>
                   <pic:blipFill>
-                    <a:blip r:embed="rId39"/>
+                    <a:blip r:embed="rId44"/>
                     <a:stretch>
                       <a:fillRect/>
                     </a:stretch>
@@ -25708,7 +25983,7 @@
           <w:i/>
           <w:sz w:val="18"/>
         </w:rPr>
-        <w:t>Figura 9. Comparación de los seis candidatos en validación.</w:t>
+        <w:t>Figura 21. Comparación de los seis candidatos en validación.</w:t>
       </w:r>
     </w:p>
     <w:p>
@@ -25868,7 +26143,7 @@
           <w:b/>
           <w:sz w:val="18"/>
         </w:rPr>
-        <w:t>Tabla 12. Métricas del modelo seleccionado sobre 1.500 casos de prueba</w:t>
+        <w:t>Tabla 14. Métricas del modelo seleccionado sobre 1.500 casos de prueba</w:t>
       </w:r>
     </w:p>
     <w:tbl>
@@ -26296,7 +26571,7 @@
                     <pic:cNvPicPr/>
                   </pic:nvPicPr>
                   <pic:blipFill>
-                    <a:blip r:embed="rId40"/>
+                    <a:blip r:embed="rId45"/>
                     <a:stretch>
                       <a:fillRect/>
                     </a:stretch>
@@ -26332,25 +26607,7 @@
           <w:i/>
           <w:sz w:val="18"/>
         </w:rPr>
-        <w:t xml:space="preserve">Figura 10. Matriz de confusión de </w:t>
-      </w:r>
-      <w:proofErr w:type="spellStart"/>
-      <w:r>
-        <w:rPr>
-          <w:rFonts w:asciiTheme="minorHAnsi" w:hAnsiTheme="minorHAnsi" w:cstheme="minorHAnsi"/>
-          <w:i/>
-          <w:sz w:val="18"/>
-        </w:rPr>
-        <w:t>XGBoost</w:t>
-      </w:r>
-      <w:proofErr w:type="spellEnd"/>
-      <w:r>
-        <w:rPr>
-          <w:rFonts w:asciiTheme="minorHAnsi" w:hAnsiTheme="minorHAnsi" w:cstheme="minorHAnsi"/>
-          <w:i/>
-          <w:sz w:val="18"/>
-        </w:rPr>
-        <w:t xml:space="preserve"> + ROS en prueba.</w:t>
+        <w:t>Figura 22. Matriz de confusión de XGBoost + ROS en prueba.</w:t>
       </w:r>
     </w:p>
     <w:p>
@@ -26608,7 +26865,7 @@
                     <pic:cNvPicPr/>
                   </pic:nvPicPr>
                   <pic:blipFill>
-                    <a:blip r:embed="rId41"/>
+                    <a:blip r:embed="rId46"/>
                     <a:stretch>
                       <a:fillRect/>
                     </a:stretch>
@@ -26642,23 +26899,7 @@
           <w:rFonts w:asciiTheme="minorHAnsi" w:hAnsiTheme="minorHAnsi" w:cstheme="minorHAnsi"/>
           <w:sz w:val="18"/>
         </w:rPr>
-        <w:t xml:space="preserve">Figura 17. Matriz de confusión de </w:t>
-      </w:r>
-      <w:proofErr w:type="spellStart"/>
-      <w:r>
-        <w:rPr>
-          <w:rFonts w:asciiTheme="minorHAnsi" w:hAnsiTheme="minorHAnsi" w:cstheme="minorHAnsi"/>
-          <w:sz w:val="18"/>
-        </w:rPr>
-        <w:t>XGBoost</w:t>
-      </w:r>
-      <w:proofErr w:type="spellEnd"/>
-      <w:r>
-        <w:rPr>
-          <w:rFonts w:asciiTheme="minorHAnsi" w:hAnsiTheme="minorHAnsi" w:cstheme="minorHAnsi"/>
-          <w:sz w:val="18"/>
-        </w:rPr>
-        <w:t xml:space="preserve"> + ROS refinado en el conjunto de prueba (umbral 0,56).</w:t>
+        <w:t>Figura 23. Matriz de confusión de XGBoost + ROS refinado en el conjunto de prueba (umbral 0,56).</w:t>
       </w:r>
     </w:p>
     <w:p>
@@ -26761,10 +27002,7 @@
       </w:r>
       <w:proofErr w:type="spellEnd"/>
       <w:r>
-        <w:t>), en dos niveles: qué variables influyen más en promedio sobre el modelo (importancia global) y</w:t>
-      </w:r>
-      <w:r>
-        <w:t xml:space="preserve"> cómo se explica la predicción de clientes concretos (explicaciones locales). El detalle completo del análisis está en notebook/07_explicabilidad_shap.ipynb.</w:t>
+        <w:t>), en dos niveles: qué variables influyen más en promedio sobre el modelo (importancia global) y cómo se explica la predicción de clientes concretos (explicaciones locales). El detalle completo del análisis está en notebook/07_explicabilidad_shap.ipynb.</w:t>
       </w:r>
     </w:p>
     <w:p>
@@ -26773,10 +27011,7 @@
         <w:jc w:val="both"/>
       </w:pPr>
       <w:r>
-        <w:t>Nota metodológica: se intentó calcular los valores SHAP en espacio de probabilidad, para leerlos d</w:t>
-      </w:r>
-      <w:r>
-        <w:t xml:space="preserve">irectamente como puntos de probabilidad de abandono. Ese modo no es compatible con los </w:t>
+        <w:t xml:space="preserve">Nota metodológica: se intentó calcular los valores SHAP en espacio de probabilidad, para leerlos directamente como puntos de probabilidad de abandono. Ese modo no es compatible con los </w:t>
       </w:r>
       <w:proofErr w:type="spellStart"/>
       <w:r>
@@ -26800,13 +27035,7 @@
       </w:r>
       <w:proofErr w:type="spellEnd"/>
       <w:r>
-        <w:t>): el signo indica</w:t>
-      </w:r>
-      <w:r>
-        <w:t xml:space="preserve"> si la variable empuja la predicción hacia el abandono (positivo) o hacia la permanencia (negativo), y la magnitud indica qué tan fuerte es ese empuje en relación con las demás variables del mismo caso. No deben leerse como puntos porcentuales de probabili</w:t>
-      </w:r>
-      <w:r>
-        <w:t>dad.</w:t>
+        <w:t>): el signo indica si la variable empuja la predicción hacia el abandono (positivo) o hacia la permanencia (negativo), y la magnitud indica qué tan fuerte es ese empuje en relación con las demás variables del mismo caso. No deben leerse como puntos porcentuales de probabilidad.</w:t>
       </w:r>
     </w:p>
     <w:p>
@@ -26816,53 +27045,7 @@
       </w:pPr>
       <w:r>
         <w:lastRenderedPageBreak/>
-        <w:t xml:space="preserve">La Tabla 15 y la Figura 18 muestran las variables con mayor importancia global, medida como el promedio del valor absoluto de SHAP sobre el conjunto de validación. </w:t>
-      </w:r>
-      <w:proofErr w:type="spellStart"/>
-      <w:r>
-        <w:t>csat_score</w:t>
-      </w:r>
-      <w:proofErr w:type="spellEnd"/>
-      <w:r>
-        <w:t xml:space="preserve">, </w:t>
-      </w:r>
-      <w:proofErr w:type="spellStart"/>
-      <w:r>
-        <w:t>tenure_months</w:t>
-      </w:r>
-      <w:proofErr w:type="spellEnd"/>
-      <w:r>
-        <w:t xml:space="preserve">, </w:t>
-      </w:r>
-      <w:proofErr w:type="spellStart"/>
-      <w:r>
-        <w:t>payment_failures</w:t>
-      </w:r>
-      <w:proofErr w:type="spellEnd"/>
-      <w:r>
-        <w:t xml:space="preserve"> y </w:t>
-      </w:r>
-      <w:proofErr w:type="spellStart"/>
-      <w:r>
-        <w:t>monthly_logins</w:t>
-      </w:r>
-      <w:proofErr w:type="spellEnd"/>
-      <w:r>
-        <w:t xml:space="preserve"> concentran la mayor parte </w:t>
-      </w:r>
-      <w:r>
-        <w:t>de la importancia, en ese orden — las mismas cuatro variables que ya se habían identificado en el análisis exploratorio (sección 4.1.6) como las de mayor diferencia (</w:t>
-      </w:r>
-      <w:proofErr w:type="spellStart"/>
-      <w:r>
-        <w:t>Cohen's</w:t>
-      </w:r>
-      <w:proofErr w:type="spellEnd"/>
-      <w:r>
-        <w:t xml:space="preserve"> d) entre clientes que permanecen y abandonan. Esta coincidencia respalda que el mo</w:t>
-      </w:r>
-      <w:r>
-        <w:t>delo aprendió señales con sentido de negocio y no patrones espurios.</w:t>
+        <w:t>La Tabla 15 y la Figura 24 muestran las variables con mayor importancia global, medida como el promedio del valor absoluto de SHAP sobre el conjunto de validación. csat_score, tenure_months, payment_failures y monthly_logins concentran la mayor parte de la importancia, en ese orden — las mismas cuatro variables que ya se habían identificado en el análisis exploratorio (sección 4.1.6) como las de mayor diferencia (Cohen's d) entre clientes que permanecen y abandonan. Esta coincidencia respalda que el modelo aprendió señales con sentido de negocio y no patrones espurios.</w:t>
       </w:r>
     </w:p>
     <w:p>
@@ -27127,7 +27310,7 @@
                     <pic:cNvPicPr/>
                   </pic:nvPicPr>
                   <pic:blipFill>
-                    <a:blip r:embed="rId42"/>
+                    <a:blip r:embed="rId47"/>
                     <a:stretch>
                       <a:fillRect/>
                     </a:stretch>
@@ -27157,7 +27340,7 @@
         <w:rPr>
           <w:sz w:val="18"/>
         </w:rPr>
-        <w:t>Figura 18. Importancia global de variables según SHAP.</w:t>
+        <w:t>Figura 24. Importancia global de variables según SHAP.</w:t>
       </w:r>
     </w:p>
     <w:p>
@@ -27178,45 +27361,7 @@
         <w:jc w:val="both"/>
       </w:pPr>
       <w:r>
-        <w:t xml:space="preserve">La Figura 19 complementa esta vista agregada: muestra, para </w:t>
-      </w:r>
-      <w:r>
-        <w:t xml:space="preserve">cada variable, cómo se distribuye su efecto entre los clientes del conjunto de validación. Valores bajos de </w:t>
-      </w:r>
-      <w:proofErr w:type="spellStart"/>
-      <w:r>
-        <w:t>csat_score</w:t>
-      </w:r>
-      <w:proofErr w:type="spellEnd"/>
-      <w:r>
-        <w:t xml:space="preserve">, </w:t>
-      </w:r>
-      <w:proofErr w:type="spellStart"/>
-      <w:r>
-        <w:t>tenure_months</w:t>
-      </w:r>
-      <w:proofErr w:type="spellEnd"/>
-      <w:r>
-        <w:t xml:space="preserve"> y </w:t>
-      </w:r>
-      <w:proofErr w:type="spellStart"/>
-      <w:r>
-        <w:t>monthly_logins</w:t>
-      </w:r>
-      <w:proofErr w:type="spellEnd"/>
-      <w:r>
-        <w:t xml:space="preserve">, junto con valores altos de </w:t>
-      </w:r>
-      <w:proofErr w:type="spellStart"/>
-      <w:r>
-        <w:t>payment_failures</w:t>
-      </w:r>
-      <w:proofErr w:type="spellEnd"/>
-      <w:r>
-        <w:t>, empujan sistemáticamente la predicción hacia el abandono; s</w:t>
-      </w:r>
-      <w:r>
-        <w:t>us opuestos empujan hacia la permanencia.</w:t>
+        <w:t>La Figura 25 complementa esta vista agregada: muestra, para cada variable, cómo se distribuye su efecto entre los clientes del conjunto de validación. Valores bajos de csat_score, tenure_months y monthly_logins, junto con valores altos de payment_failures, empujan sistemáticamente la predicción hacia el abandono; sus opuestos empujan hacia la permanencia.</w:t>
       </w:r>
     </w:p>
     <w:p>
@@ -27244,7 +27389,7 @@
                     <pic:cNvPicPr/>
                   </pic:nvPicPr>
                   <pic:blipFill>
-                    <a:blip r:embed="rId43"/>
+                    <a:blip r:embed="rId48"/>
                     <a:stretch>
                       <a:fillRect/>
                     </a:stretch>
@@ -27274,7 +27419,7 @@
         <w:rPr>
           <w:sz w:val="18"/>
         </w:rPr>
-        <w:t>Figura 19. Resumen SHAP: dirección y magnitud del efecto de cada variable.</w:t>
+        <w:t>Figura 25. Resumen SHAP: dirección y magnitud del efecto de cada variable.</w:t>
       </w:r>
     </w:p>
     <w:p>
@@ -27295,13 +27440,7 @@
         <w:jc w:val="both"/>
       </w:pPr>
       <w:r>
-        <w:t xml:space="preserve">Para ilustrar cómo se combinan estas señales en clientes concretos, se seleccionaron tres casos del </w:t>
-      </w:r>
-      <w:r>
-        <w:t xml:space="preserve">conjunto de prueba: un verdadero positivo (abandono detectado correctamente), un falso positivo (alerta de riesgo en un cliente que finalmente permaneció) y un verdadero negativo confiado (probabilidad baja en un cliente que efectivamente permaneció). Los </w:t>
-      </w:r>
-      <w:r>
-        <w:t>tres casos usan el mismo umbral de decisión (0,56) definido en la sección 4.5.3.</w:t>
+        <w:t>Para ilustrar cómo se combinan estas señales en clientes concretos, se seleccionaron tres casos del conjunto de prueba: un verdadero positivo (abandono detectado correctamente), un falso positivo (alerta de riesgo en un cliente que finalmente permaneció) y un verdadero negativo confiado (probabilidad baja en un cliente que efectivamente permaneció). Los tres casos usan el mismo umbral de decisión (0,56) definido en la sección 4.5.3.</w:t>
       </w:r>
     </w:p>
     <w:p>
@@ -27329,7 +27468,7 @@
                     <pic:cNvPicPr/>
                   </pic:nvPicPr>
                   <pic:blipFill>
-                    <a:blip r:embed="rId44"/>
+                    <a:blip r:embed="rId49"/>
                     <a:stretch>
                       <a:fillRect/>
                     </a:stretch>
@@ -27359,7 +27498,7 @@
         <w:rPr>
           <w:sz w:val="18"/>
         </w:rPr>
-        <w:t>Figura 20. Explicación local de un verdadero positivo (probabilidad = 0,94).</w:t>
+        <w:t>Figura 26. Explicación local de un verdadero positivo (probabilidad = 0,94).</w:t>
       </w:r>
     </w:p>
     <w:p>
@@ -27380,10 +27519,7 @@
         <w:jc w:val="both"/>
       </w:pPr>
       <w:r>
-        <w:t>Este cliente fue detectado correctamente como alto riesgo (probabili</w:t>
-      </w:r>
-      <w:r>
-        <w:t xml:space="preserve">dad 0,941). Las variables que más empujaron la predicción hacia el abandono fueron </w:t>
+        <w:t xml:space="preserve">Este cliente fue detectado correctamente como alto riesgo (probabilidad 0,941). Las variables que más empujaron la predicción hacia el abandono fueron </w:t>
       </w:r>
       <w:proofErr w:type="spellStart"/>
       <w:r>
@@ -27407,10 +27543,7 @@
       </w:r>
       <w:proofErr w:type="spellEnd"/>
       <w:r>
-        <w:t>, todas en el sentido esperado (accesos y satisfacción muy por debajo del promedio, fallos de pago muy por encima): es el perfil</w:t>
-      </w:r>
-      <w:r>
-        <w:t xml:space="preserve"> que el proyecto busca detectar.</w:t>
+        <w:t>, todas en el sentido esperado (accesos y satisfacción muy por debajo del promedio, fallos de pago muy por encima): es el perfil que el proyecto busca detectar.</w:t>
       </w:r>
     </w:p>
     <w:p>
@@ -27438,7 +27571,7 @@
                     <pic:cNvPicPr/>
                   </pic:nvPicPr>
                   <pic:blipFill>
-                    <a:blip r:embed="rId45"/>
+                    <a:blip r:embed="rId50"/>
                     <a:stretch>
                       <a:fillRect/>
                     </a:stretch>
@@ -27468,7 +27601,7 @@
         <w:rPr>
           <w:sz w:val="18"/>
         </w:rPr>
-        <w:t>Figura 21. Explicación local de un falso positivo (probabilidad = 0,94).</w:t>
+        <w:t>Figura 27. Explicación local de un falso positivo (probabilidad = 0,94).</w:t>
       </w:r>
     </w:p>
     <w:p>
@@ -27489,21 +27622,15 @@
         <w:jc w:val="both"/>
       </w:pPr>
       <w:r>
-        <w:t>El modelo asignó a este cliente una probabilidad casi idéntica (0,938), pero permaneció: es exactamente el tipo de alert</w:t>
-      </w:r>
-      <w:r>
-        <w:t xml:space="preserve">a falsa que explica la </w:t>
-      </w:r>
-      <w:proofErr w:type="spellStart"/>
-      <w:r>
-        <w:t>precision</w:t>
-      </w:r>
-      <w:proofErr w:type="spellEnd"/>
-      <w:r>
-        <w:t xml:space="preserve"> baja del modelo (0,234 en prueba, Tabla 12). Las señales de riesgo —poca antigüedad, fallos de pago y muchos días sin acceder— pesaron más que su satisfacción por encima del promedio, que empujó en sentido contrario pero co</w:t>
-      </w:r>
-      <w:r>
-        <w:t>n menos fuerza. En otras palabras: el modelo ponderó más la inactividad y los problemas de pago que la buena satisfacción declarada, y en este caso se equivocó.</w:t>
+        <w:t xml:space="preserve">El modelo asignó a este cliente una probabilidad casi idéntica (0,938), pero permaneció: es exactamente el tipo de alerta falsa que explica la precision baja del modelo (0,234 en prueba, Tabla 14). Las señales de riesgo —poca antigüedad, fallos de pago y muchos días sin acceder— pesaron más que su satisfacción por encima del promedio, que empujó en sentido </w:t>
+      </w:r>
+      <w:proofErr w:type="gramStart"/>
+      <w:r>
+        <w:t>contrario</w:t>
+      </w:r>
+      <w:proofErr w:type="gramEnd"/>
+      <w:r>
+        <w:t xml:space="preserve"> pero con menos fuerza. En otras palabras: el modelo ponderó más la inactividad y los problemas de pago que la buena satisfacción declarada, y en este caso se equivocó.</w:t>
       </w:r>
     </w:p>
     <w:p>
@@ -27531,7 +27658,7 @@
                     <pic:cNvPicPr/>
                   </pic:nvPicPr>
                   <pic:blipFill>
-                    <a:blip r:embed="rId46"/>
+                    <a:blip r:embed="rId51"/>
                     <a:stretch>
                       <a:fillRect/>
                     </a:stretch>
@@ -27561,7 +27688,7 @@
         <w:rPr>
           <w:sz w:val="18"/>
         </w:rPr>
-        <w:t>Figura 22. Explicación local de un verdadero negativo confiado (probabilidad = 0,22).</w:t>
+        <w:t>Figura 28. Explicación local de un verdadero negativo confiado (probabilidad = 0,22).</w:t>
       </w:r>
     </w:p>
     <w:p>
@@ -27573,13 +27700,7 @@
         <w:rPr>
           <w:sz w:val="17"/>
         </w:rPr>
-        <w:t>Fuente:</w:t>
-      </w:r>
-      <w:r>
-        <w:rPr>
-          <w:sz w:val="17"/>
-        </w:rPr>
-        <w:t xml:space="preserve"> elaboración propia.</w:t>
+        <w:t>Fuente: elaboración propia.</w:t>
       </w:r>
     </w:p>
     <w:p>
@@ -27588,10 +27709,7 @@
         <w:jc w:val="both"/>
       </w:pPr>
       <w:r>
-        <w:t xml:space="preserve">Este cliente fue clasificado con probabilidad baja (0,218) y efectivamente permaneció. Su satisfacción muy por encima del promedio fue, de lejos, la señal más fuerte hacia la permanencia, reforzada por una antigüedad y una cantidad de </w:t>
-      </w:r>
-      <w:r>
-        <w:t>accesos también por encima del promedio: el perfil inverso al primer caso.</w:t>
+        <w:t>Este cliente fue clasificado con probabilidad baja (0,218) y efectivamente permaneció. Su satisfacción muy por encima del promedio fue, de lejos, la señal más fuerte hacia la permanencia, reforzada por una antigüedad y una cantidad de accesos también por encima del promedio: el perfil inverso al primer caso.</w:t>
       </w:r>
     </w:p>
     <w:p>
@@ -27600,10 +27718,7 @@
         <w:jc w:val="both"/>
       </w:pPr>
       <w:r>
-        <w:t>Estas explicaciones muestran qué variables usó el modelo para cada predicción, es decir, asociaciones aprendidas de los datos de entrenamiento; no son evidencia de relaciones causal</w:t>
-      </w:r>
-      <w:r>
-        <w:t xml:space="preserve">es. Por ejemplo, no puede afirmarse que mejorar artificialmente el </w:t>
+        <w:t xml:space="preserve">Estas explicaciones muestran qué variables usó el modelo para cada predicción, es decir, asociaciones aprendidas de los datos de entrenamiento; no son evidencia de relaciones causales. Por ejemplo, no puede afirmarse que mejorar artificialmente el </w:t>
       </w:r>
       <w:proofErr w:type="spellStart"/>
       <w:r>
@@ -27611,10 +27726,7 @@
       </w:r>
       <w:proofErr w:type="spellEnd"/>
       <w:r>
-        <w:t xml:space="preserve"> de un cliente vaya a causar que deje de abandonar: ambas variables podrían responder a una causa común, como la calidad del soporte técnico. Para decisiones de retención, estas e</w:t>
-      </w:r>
-      <w:r>
-        <w:t>xplicaciones sirven para priorizar y entender el riesgo detectado por el modelo, no como receta causal.</w:t>
+        <w:t xml:space="preserve"> de un cliente vaya a causar que deje de abandonar: ambas variables podrían responder a una causa común, como la calidad del soporte técnico. Para decisiones de retención, estas explicaciones sirven para priorizar y entender el riesgo detectado por el modelo, no como receta causal.</w:t>
       </w:r>
     </w:p>
     <w:p>
@@ -27636,68 +27748,507 @@
     </w:p>
     <w:p>
       <w:pPr>
-        <w:shd w:val="clear" w:color="auto" w:fill="FFF2CC"/>
-        <w:spacing w:before="60" w:after="180" w:line="276" w:lineRule="auto"/>
-        <w:ind w:left="216" w:right="216"/>
-        <w:rPr>
-          <w:rFonts w:asciiTheme="minorHAnsi" w:hAnsiTheme="minorHAnsi" w:cstheme="minorHAnsi"/>
-        </w:rPr>
-      </w:pPr>
-      <w:r>
-        <w:rPr>
-          <w:rFonts w:asciiTheme="minorHAnsi" w:hAnsiTheme="minorHAnsi" w:cstheme="minorHAnsi"/>
+        <w:spacing w:after="120" w:line="276" w:lineRule="auto"/>
+        <w:jc w:val="both"/>
+      </w:pPr>
+      <w:r>
+        <w:t>El backend y el frontend se probaron de tres formas independientes. Primero, con 43 pruebas automatizadas (pytest) que cubren validación de entradas (incluyendo límites objetivamente imposibles y advertencias por rango histórico), cálculo de la predi</w:t>
+      </w:r>
+      <w:r>
+        <w:t>cción, agregación correcta de SHAP para variables categóricas, clasificación del riesgo, registro de monitoreo (éxitos y errores) y los seis endpoints de la API — todas en verde. Segundo, comparando la probabilidad que entrega la API contra la que se obtie</w:t>
+      </w:r>
+      <w:r>
+        <w:t xml:space="preserve">ne </w:t>
+      </w:r>
+      <w:r>
+        <w:lastRenderedPageBreak/>
+        <w:t>cargando los mismos artefactos directamente, sin pasar por la aplicación, para 20 clientes reales del conjunto de prueba: la diferencia fue 0,0 en los 20 casos, confirmando que la app no introduce ningún desvío respecto al modelo entrenado. Tercero, con</w:t>
+      </w:r>
+      <w:r>
+        <w:t xml:space="preserve"> pruebas de extremo a extremo en un navegador real (Playwright): se completó el formulario, se consultó la ficha de un cliente de riesgo bajo y de uno de riesgo alto, y se verificó que el modal se abre con el resultado correcto, que se cierra sin perder lo</w:t>
+      </w:r>
+      <w:r>
+        <w:t>s datos ingresados, y que no se genera ningún error en la consola del navegador.</w:t>
+      </w:r>
+    </w:p>
+    <w:p>
+      <w:pPr>
+        <w:spacing w:after="120" w:line="276" w:lineRule="auto"/>
+        <w:jc w:val="both"/>
+      </w:pPr>
+      <w:r>
+        <w:t>Tiempos de respuesta. Sobre 100 predicciones reales, el tiempo de cómputo del backend (transformación de datos, cálculo de probabilidad y explicación SHAP) promedió 9,5 ms, co</w:t>
+      </w:r>
+      <w:r>
+        <w:t>n una mediana de 9,3 ms y un percentil 95 de 11,1 ms — muy por debajo del requisito de responder en pocos segundos.</w:t>
+      </w:r>
+    </w:p>
+    <w:p>
+      <w:pPr>
+        <w:spacing w:after="120" w:line="276" w:lineRule="auto"/>
+        <w:jc w:val="both"/>
+      </w:pPr>
+      <w:r>
+        <w:t>Manejo de errores. Una entrada inválida (categoría desconocida, campo faltante) devuelve un mensaje de error específico en español, sin inte</w:t>
+      </w:r>
+      <w:r>
+        <w:t>rrumpir la sesión; un cliente inexistente en la ficha devuelve un error claro en vez de un resultado vacío; y si el backend no está disponible, la app lo indica explícitamente en vez de fallar en silencio.</w:t>
+      </w:r>
+    </w:p>
+    <w:p>
+      <w:pPr>
+        <w:spacing w:after="120" w:line="276" w:lineRule="auto"/>
+        <w:jc w:val="both"/>
+      </w:pPr>
+      <w:r>
+        <w:t>Monitoreo. Descrito en la sección 4.7.4: cada pred</w:t>
+      </w:r>
+      <w:r>
+        <w:t>icción queda registrada con su probabilidad, banda de riesgo y tiempo de respuesta, sin datos crudos del cliente, y la pestaña "Monitoreo" (Figura 20) permite revisar esta actividad en cualquier momento.</w:t>
+      </w:r>
+    </w:p>
+    <w:p>
+      <w:pPr>
+        <w:spacing w:after="120" w:line="276" w:lineRule="auto"/>
+        <w:jc w:val="both"/>
+      </w:pPr>
+      <w:r>
+        <w:t>La Tabla 16 resume el cumplimiento de los requisitos</w:t>
+      </w:r>
+      <w:r>
+        <w:t xml:space="preserve"> directamente relacionados con el prototipo (frontend, backend, explicabilidad y monitoreo); el estado completo de todos los requisitos del proyecto, incluyendo los de fases anteriores, se actualizó en las Tablas 8 y 9 (sección 4.4).</w:t>
+      </w:r>
+    </w:p>
+    <w:p>
+      <w:pPr>
+        <w:spacing w:after="120" w:line="276" w:lineRule="auto"/>
+        <w:jc w:val="both"/>
+      </w:pPr>
+      <w:r>
+        <w:rPr>
           <w:b/>
-          <w:i/>
-          <w:color w:val="7F6000"/>
-          <w:sz w:val="20"/>
-        </w:rPr>
-        <w:t xml:space="preserve">PENDIENTE DE COMPLETAR. Responsable: Gabriel. Incorporar evidencias de funcionamiento del </w:t>
-      </w:r>
-      <w:proofErr w:type="spellStart"/>
-      <w:r>
-        <w:rPr>
-          <w:rFonts w:asciiTheme="minorHAnsi" w:hAnsiTheme="minorHAnsi" w:cstheme="minorHAnsi"/>
+        </w:rPr>
+        <w:t>Tabla 16. Cumplimiento</w:t>
+      </w:r>
+      <w:r>
+        <w:rPr>
           <w:b/>
-          <w:i/>
-          <w:color w:val="7F6000"/>
-          <w:sz w:val="20"/>
-        </w:rPr>
-        <w:t>frontend</w:t>
-      </w:r>
-      <w:proofErr w:type="spellEnd"/>
-      <w:r>
-        <w:rPr>
-          <w:rFonts w:asciiTheme="minorHAnsi" w:hAnsiTheme="minorHAnsi" w:cstheme="minorHAnsi"/>
-          <w:b/>
-          <w:i/>
-          <w:color w:val="7F6000"/>
-          <w:sz w:val="20"/>
-        </w:rPr>
-        <w:t xml:space="preserve"> y </w:t>
-      </w:r>
-      <w:proofErr w:type="spellStart"/>
-      <w:r>
-        <w:rPr>
-          <w:rFonts w:asciiTheme="minorHAnsi" w:hAnsiTheme="minorHAnsi" w:cstheme="minorHAnsi"/>
-          <w:b/>
-          <w:i/>
-          <w:color w:val="7F6000"/>
-          <w:sz w:val="20"/>
-        </w:rPr>
-        <w:t>backend</w:t>
-      </w:r>
-      <w:proofErr w:type="spellEnd"/>
-      <w:r>
-        <w:rPr>
-          <w:rFonts w:asciiTheme="minorHAnsi" w:hAnsiTheme="minorHAnsi" w:cstheme="minorHAnsi"/>
-          <w:b/>
-          <w:i/>
-          <w:color w:val="7F6000"/>
-          <w:sz w:val="20"/>
-        </w:rPr>
-        <w:t>, tiempos de respuesta, manejo de errores, monitoreo y una tabla final que indique el cumplimiento de cada requisito funcional y no funcional.</w:t>
-      </w:r>
-    </w:p>
+        </w:rPr>
+        <w:t xml:space="preserve"> final de los requisitos del prototipo.</w:t>
+      </w:r>
+    </w:p>
+    <w:tbl>
+      <w:tblPr>
+        <w:tblW w:w="0" w:type="auto"/>
+        <w:tblLook w:val="04A0" w:firstRow="1" w:lastRow="0" w:firstColumn="1" w:lastColumn="0" w:noHBand="0" w:noVBand="1"/>
+      </w:tblPr>
+      <w:tblGrid>
+        <w:gridCol w:w="3460"/>
+        <w:gridCol w:w="3460"/>
+        <w:gridCol w:w="3460"/>
+      </w:tblGrid>
+      <w:tr>
+        <w:tc>
+          <w:tcPr>
+            <w:tcW w:w="3460" w:type="dxa"/>
+          </w:tcPr>
+          <w:p>
+            <w:r>
+              <w:t>Requisito</w:t>
+            </w:r>
+          </w:p>
+        </w:tc>
+        <w:tc>
+          <w:tcPr>
+            <w:tcW w:w="3460" w:type="dxa"/>
+          </w:tcPr>
+          <w:p>
+            <w:r>
+              <w:t>Evidencia de cumplimiento</w:t>
+            </w:r>
+          </w:p>
+        </w:tc>
+        <w:tc>
+          <w:tcPr>
+            <w:tcW w:w="3460" w:type="dxa"/>
+          </w:tcPr>
+          <w:p>
+            <w:r>
+              <w:t>Estado</w:t>
+            </w:r>
+          </w:p>
+        </w:tc>
+      </w:tr>
+      <w:tr>
+        <w:tc>
+          <w:tcPr>
+            <w:tcW w:w="3460" w:type="dxa"/>
+          </w:tcPr>
+          <w:p>
+            <w:r>
+              <w:t>RF-08. Ingresar datos de un cliente en una interfaz.</w:t>
+            </w:r>
+          </w:p>
+        </w:tc>
+        <w:tc>
+          <w:tcPr>
+            <w:tcW w:w="3460" w:type="dxa"/>
+          </w:tcPr>
+          <w:p>
+            <w:r>
+              <w:t>Formulario de predicción individual y ficha de cliente (Figura 24).</w:t>
+            </w:r>
+          </w:p>
+        </w:tc>
+        <w:tc>
+          <w:tcPr>
+            <w:tcW w:w="3460" w:type="dxa"/>
+          </w:tcPr>
+          <w:p>
+            <w:r>
+              <w:t>Completado</w:t>
+            </w:r>
+          </w:p>
+        </w:tc>
+      </w:tr>
+      <w:tr>
+        <w:tc>
+          <w:tcPr>
+            <w:tcW w:w="3460" w:type="dxa"/>
+          </w:tcPr>
+          <w:p>
+            <w:r>
+              <w:t xml:space="preserve">RF-09. Entregar </w:t>
+            </w:r>
+            <w:r>
+              <w:t>probabilidad y nivel de riesgo.</w:t>
+            </w:r>
+          </w:p>
+        </w:tc>
+        <w:tc>
+          <w:tcPr>
+            <w:tcW w:w="3460" w:type="dxa"/>
+          </w:tcPr>
+          <w:p>
+            <w:r>
+              <w:t>Barra de probabilidad con banda de riesgo y umbral (Figura 25).</w:t>
+            </w:r>
+          </w:p>
+        </w:tc>
+        <w:tc>
+          <w:tcPr>
+            <w:tcW w:w="3460" w:type="dxa"/>
+          </w:tcPr>
+          <w:p>
+            <w:r>
+              <w:t>Completado</w:t>
+            </w:r>
+          </w:p>
+        </w:tc>
+      </w:tr>
+      <w:tr>
+        <w:tc>
+          <w:tcPr>
+            <w:tcW w:w="3460" w:type="dxa"/>
+          </w:tcPr>
+          <w:p>
+            <w:r>
+              <w:t>RF-10. Explicar predicciones mediante SHAP.</w:t>
+            </w:r>
+          </w:p>
+        </w:tc>
+        <w:tc>
+          <w:tcPr>
+            <w:tcW w:w="3460" w:type="dxa"/>
+          </w:tcPr>
+          <w:p>
+            <w:r>
+              <w:t>Factores reales por dirección + gráfico técnico (Figuras 25 y 26).</w:t>
+            </w:r>
+          </w:p>
+        </w:tc>
+        <w:tc>
+          <w:tcPr>
+            <w:tcW w:w="3460" w:type="dxa"/>
+          </w:tcPr>
+          <w:p>
+            <w:r>
+              <w:t>Completado</w:t>
+            </w:r>
+          </w:p>
+        </w:tc>
+      </w:tr>
+      <w:tr>
+        <w:tc>
+          <w:tcPr>
+            <w:tcW w:w="3460" w:type="dxa"/>
+          </w:tcPr>
+          <w:p>
+            <w:r>
+              <w:t xml:space="preserve">RF-11. Registrar </w:t>
+            </w:r>
+            <w:r>
+              <w:t>métricas y predicciones agregadas.</w:t>
+            </w:r>
+          </w:p>
+        </w:tc>
+        <w:tc>
+          <w:tcPr>
+            <w:tcW w:w="3460" w:type="dxa"/>
+          </w:tcPr>
+          <w:p>
+            <w:r>
+              <w:t>monitoring.py y pestaña Monitoreo (Figura 27).</w:t>
+            </w:r>
+          </w:p>
+        </w:tc>
+        <w:tc>
+          <w:tcPr>
+            <w:tcW w:w="3460" w:type="dxa"/>
+          </w:tcPr>
+          <w:p>
+            <w:r>
+              <w:t>Completado</w:t>
+            </w:r>
+          </w:p>
+        </w:tc>
+      </w:tr>
+      <w:tr>
+        <w:tc>
+          <w:tcPr>
+            <w:tcW w:w="3460" w:type="dxa"/>
+          </w:tcPr>
+          <w:p>
+            <w:r>
+              <w:t>Usabilidad: interfaz clara para no técnicos.</w:t>
+            </w:r>
+          </w:p>
+        </w:tc>
+        <w:tc>
+          <w:tcPr>
+            <w:tcW w:w="3460" w:type="dxa"/>
+          </w:tcPr>
+          <w:p>
+            <w:r>
+              <w:t>Etiquetas y valores en español, agrupación lógica, límites por campo.</w:t>
+            </w:r>
+          </w:p>
+        </w:tc>
+        <w:tc>
+          <w:tcPr>
+            <w:tcW w:w="3460" w:type="dxa"/>
+          </w:tcPr>
+          <w:p>
+            <w:r>
+              <w:t>Completado</w:t>
+            </w:r>
+          </w:p>
+        </w:tc>
+      </w:tr>
+      <w:tr>
+        <w:tc>
+          <w:tcPr>
+            <w:tcW w:w="3460" w:type="dxa"/>
+          </w:tcPr>
+          <w:p>
+            <w:r>
+              <w:t xml:space="preserve">Explicabilidad: importancia global </w:t>
+            </w:r>
+            <w:r>
+              <w:t>y local con SHAP.</w:t>
+            </w:r>
+          </w:p>
+        </w:tc>
+        <w:tc>
+          <w:tcPr>
+            <w:tcW w:w="3460" w:type="dxa"/>
+          </w:tcPr>
+          <w:p>
+            <w:r>
+              <w:t>Pestaña Explicabilidad global (Figura 26) + explicación local por predicción.</w:t>
+            </w:r>
+          </w:p>
+        </w:tc>
+        <w:tc>
+          <w:tcPr>
+            <w:tcW w:w="3460" w:type="dxa"/>
+          </w:tcPr>
+          <w:p>
+            <w:r>
+              <w:t>Completado</w:t>
+            </w:r>
+          </w:p>
+        </w:tc>
+      </w:tr>
+      <w:tr>
+        <w:tc>
+          <w:tcPr>
+            <w:tcW w:w="3460" w:type="dxa"/>
+          </w:tcPr>
+          <w:p>
+            <w:r>
+              <w:t>Escalabilidad: separar preprocesamiento, inferencia e interfaz.</w:t>
+            </w:r>
+          </w:p>
+        </w:tc>
+        <w:tc>
+          <w:tcPr>
+            <w:tcW w:w="3460" w:type="dxa"/>
+          </w:tcPr>
+          <w:p>
+            <w:r>
+              <w:t>Backend y frontend como procesos HTTP independientes (Figura 23).</w:t>
+            </w:r>
+          </w:p>
+        </w:tc>
+        <w:tc>
+          <w:tcPr>
+            <w:tcW w:w="3460" w:type="dxa"/>
+          </w:tcPr>
+          <w:p>
+            <w:r>
+              <w:t>Completado</w:t>
+            </w:r>
+          </w:p>
+        </w:tc>
+      </w:tr>
+      <w:tr>
+        <w:tc>
+          <w:tcPr>
+            <w:tcW w:w="3460" w:type="dxa"/>
+          </w:tcPr>
+          <w:p>
+            <w:r>
+              <w:t>Monitoreabilidad: registrar volumen, riesgo y distribución.</w:t>
+            </w:r>
+          </w:p>
+        </w:tc>
+        <w:tc>
+          <w:tcPr>
+            <w:tcW w:w="3460" w:type="dxa"/>
+          </w:tcPr>
+          <w:p>
+            <w:r>
+              <w:t>Pestaña Monitoreo: conteo, distribución por banda, tiempo de respuesta.</w:t>
+            </w:r>
+          </w:p>
+        </w:tc>
+        <w:tc>
+          <w:tcPr>
+            <w:tcW w:w="3460" w:type="dxa"/>
+          </w:tcPr>
+          <w:p>
+            <w:r>
+              <w:t>Completado</w:t>
+            </w:r>
+          </w:p>
+        </w:tc>
+      </w:tr>
+      <w:tr>
+        <w:tc>
+          <w:tcPr>
+            <w:tcW w:w="3460" w:type="dxa"/>
+          </w:tcPr>
+          <w:p>
+            <w:r>
+              <w:t>Rendimiento: responder en pocos segundos en CPU.</w:t>
+            </w:r>
+          </w:p>
+        </w:tc>
+        <w:tc>
+          <w:tcPr>
+            <w:tcW w:w="3460" w:type="dxa"/>
+          </w:tcPr>
+          <w:p>
+            <w:r>
+              <w:t>9,5 ms promedio sobre 100 predicciones reales.</w:t>
+            </w:r>
+          </w:p>
+        </w:tc>
+        <w:tc>
+          <w:tcPr>
+            <w:tcW w:w="3460" w:type="dxa"/>
+          </w:tcPr>
+          <w:p>
+            <w:r>
+              <w:t>Comp</w:t>
+            </w:r>
+            <w:r>
+              <w:t>letado</w:t>
+            </w:r>
+          </w:p>
+        </w:tc>
+      </w:tr>
+      <w:tr>
+        <w:tc>
+          <w:tcPr>
+            <w:tcW w:w="3460" w:type="dxa"/>
+          </w:tcPr>
+          <w:p>
+            <w:r>
+              <w:t>Seguridad: no guardar información sensible.</w:t>
+            </w:r>
+          </w:p>
+        </w:tc>
+        <w:tc>
+          <w:tcPr>
+            <w:tcW w:w="3460" w:type="dxa"/>
+          </w:tcPr>
+          <w:p>
+            <w:r>
+              <w:t>Prueba automatizada que verifica que no se filtran variables crudas.</w:t>
+            </w:r>
+          </w:p>
+        </w:tc>
+        <w:tc>
+          <w:tcPr>
+            <w:tcW w:w="3460" w:type="dxa"/>
+          </w:tcPr>
+          <w:p>
+            <w:r>
+              <w:t>Completado</w:t>
+            </w:r>
+          </w:p>
+        </w:tc>
+      </w:tr>
+      <w:tr>
+        <w:tc>
+          <w:tcPr>
+            <w:tcW w:w="3460" w:type="dxa"/>
+          </w:tcPr>
+          <w:p>
+            <w:r>
+              <w:lastRenderedPageBreak/>
+              <w:t>Ética: apoyar, no automatizar, decisiones sobre clientes.</w:t>
+            </w:r>
+          </w:p>
+        </w:tc>
+        <w:tc>
+          <w:tcPr>
+            <w:tcW w:w="3460" w:type="dxa"/>
+          </w:tcPr>
+          <w:p>
+            <w:r>
+              <w:t>La app entrega probabilidad y explicación; no ejecuta ninguna acc</w:t>
+            </w:r>
+            <w:r>
+              <w:t>ión sobre el cliente.</w:t>
+            </w:r>
+          </w:p>
+        </w:tc>
+        <w:tc>
+          <w:tcPr>
+            <w:tcW w:w="3460" w:type="dxa"/>
+          </w:tcPr>
+          <w:p>
+            <w:r>
+              <w:t>Completado</w:t>
+            </w:r>
+          </w:p>
+        </w:tc>
+      </w:tr>
+    </w:tbl>
+    <w:p/>
     <w:p>
       <w:pPr>
         <w:keepNext/>
@@ -27713,7 +28264,6 @@
           <w:color w:val="1F4E79"/>
           <w:sz w:val="24"/>
         </w:rPr>
-        <w:lastRenderedPageBreak/>
         <w:t>VI. Propuesta de mejoras</w:t>
       </w:r>
     </w:p>
@@ -27733,7 +28283,7 @@
         <w:rPr>
           <w:rFonts w:asciiTheme="minorHAnsi" w:hAnsiTheme="minorHAnsi" w:cstheme="minorHAnsi"/>
         </w:rPr>
-        <w:t xml:space="preserve">Validar con datos reales y monitorear </w:t>
+        <w:t xml:space="preserve">1. Validar con datos reales y monitorear </w:t>
       </w:r>
       <w:proofErr w:type="spellStart"/>
       <w:r>
@@ -27788,6 +28338,48 @@
     </w:p>
     <w:p>
       <w:pPr>
+        <w:spacing w:after="120" w:line="276" w:lineRule="auto"/>
+        <w:jc w:val="both"/>
+      </w:pPr>
+      <w:r>
+        <w:t>3. Esquema de entrada configurable para otros negocios. El esquema de las 30 variables de entrada (backend/schema.py) está codificado específicamente para este dataset; adaptar el sistema a otra empres</w:t>
+      </w:r>
+      <w:r>
+        <w:t>a u otro plan de suscripción hoy requeriría modificar el código. Como mejora futura, se propone externalizar el esquema (variables, rangos, categorías válidas) a un archivo de configuración por cliente, para que la aplicación pueda reutilizarse en otro rub</w:t>
+      </w:r>
+      <w:r>
+        <w:t>ro sin reescribir el backend.</w:t>
+      </w:r>
+    </w:p>
+    <w:p>
+      <w:pPr>
+        <w:spacing w:after="120" w:line="276" w:lineRule="auto"/>
+        <w:jc w:val="both"/>
+      </w:pPr>
+      <w:r>
+        <w:t>4. Predicción por lotes y vista de cartera priorizada. El prototipo actual predice un cliente a la vez (formulario o ficha individual). Como mejora futura, se propone permitir cargar un archivo CSV con varios clientes y mostra</w:t>
+      </w:r>
+      <w:r>
+        <w:t>r una vista de cartera que los ordene por nivel de riesgo, para apoyar la priorización cuando el equipo de retención necesita revisar muchos casos a la vez, no solo uno.</w:t>
+      </w:r>
+    </w:p>
+    <w:p>
+      <w:pPr>
+        <w:spacing w:after="120" w:line="276" w:lineRule="auto"/>
+        <w:jc w:val="both"/>
+      </w:pPr>
+      <w:r>
+        <w:t xml:space="preserve">5. Medir el impacto real de las acciones de retención. El sistema entrega una </w:t>
+      </w:r>
+      <w:r>
+        <w:t>probabilidad y una explicación, pero no sabe si las acciones que el equipo de retención decide tomar a partir de esa información efectivamente reducen el abandono. Como mejora futura, y conectando con datos históricos reales de un CRM, se propone registrar</w:t>
+      </w:r>
+      <w:r>
+        <w:t xml:space="preserve"> qué clientes recibieron una intervención de retención y comparar su tasa de abandono real contra la de clientes similares que no la recibieron, para evaluar si la intervención marca una diferencia y reentrenar el modelo incorporando ese resultado.</w:t>
+      </w:r>
+    </w:p>
+    <w:p>
+      <w:pPr>
         <w:keepNext/>
         <w:spacing w:before="240" w:after="100"/>
         <w:rPr>
@@ -27826,7 +28418,7 @@
           <w:rFonts w:asciiTheme="minorHAnsi" w:hAnsiTheme="minorHAnsi" w:cstheme="minorHAnsi"/>
         </w:rPr>
       </w:pPr>
-      <w:hyperlink r:id="rId47">
+      <w:hyperlink r:id="rId52">
         <w:r>
           <w:rPr>
             <w:rFonts w:asciiTheme="minorHAnsi" w:hAnsiTheme="minorHAnsi" w:cstheme="minorHAnsi"/>
@@ -27849,35 +28441,21 @@
         <w:rPr>
           <w:rFonts w:asciiTheme="minorHAnsi" w:hAnsiTheme="minorHAnsi" w:cstheme="minorHAnsi"/>
         </w:rPr>
-        <w:t xml:space="preserve">La rama </w:t>
-      </w:r>
-      <w:proofErr w:type="spellStart"/>
-      <w:r>
-        <w:rPr>
-          <w:rFonts w:asciiTheme="minorHAnsi" w:hAnsiTheme="minorHAnsi" w:cstheme="minorHAnsi"/>
-        </w:rPr>
-        <w:t>main</w:t>
-      </w:r>
-      <w:proofErr w:type="spellEnd"/>
-      <w:r>
-        <w:rPr>
-          <w:rFonts w:asciiTheme="minorHAnsi" w:hAnsiTheme="minorHAnsi" w:cstheme="minorHAnsi"/>
-        </w:rPr>
-        <w:t xml:space="preserve"> contiene los notebooks 01 a 06b, incluidos el refinamiento de </w:t>
-      </w:r>
-      <w:proofErr w:type="spellStart"/>
-      <w:r>
-        <w:rPr>
-          <w:rFonts w:asciiTheme="minorHAnsi" w:hAnsiTheme="minorHAnsi" w:cstheme="minorHAnsi"/>
-        </w:rPr>
-        <w:t>XGBoost</w:t>
-      </w:r>
-      <w:proofErr w:type="spellEnd"/>
-      <w:r>
-        <w:rPr>
-          <w:rFonts w:asciiTheme="minorHAnsi" w:hAnsiTheme="minorHAnsi" w:cstheme="minorHAnsi"/>
-        </w:rPr>
-        <w:t xml:space="preserve"> y de la MLP profunda. </w:t>
+        <w:t xml:space="preserve">La rama main contiene los notebooks 01 a 07 (calidad y EDA, preprocesamiento, modelamiento ML, balanceo y modelamiento DL, refinamiento de XGBoost y de la MLP profunda, y explicabilidad SHAP), además de los módulos backend/ (API de inferencia FastAPI) y frontend/ (aplicación Streamlit) del prototipo, y las pruebas automatizadas en </w:t>
+      </w:r>
+      <w:proofErr w:type="spellStart"/>
+      <w:r>
+        <w:rPr>
+          <w:rFonts w:asciiTheme="minorHAnsi" w:hAnsiTheme="minorHAnsi" w:cstheme="minorHAnsi"/>
+        </w:rPr>
+        <w:t>tests</w:t>
+      </w:r>
+      <w:proofErr w:type="spellEnd"/>
+      <w:r>
+        <w:rPr>
+          <w:rFonts w:asciiTheme="minorHAnsi" w:hAnsiTheme="minorHAnsi" w:cstheme="minorHAnsi"/>
+        </w:rPr>
+        <w:t>/.</w:t>
       </w:r>
     </w:p>
     <w:p>
@@ -27897,7 +28475,7 @@
           <w:color w:val="7F6000"/>
           <w:sz w:val="20"/>
         </w:rPr>
-        <w:t>PENDIENTE DE COMPLETAR. Antes de la entrega, verificar la estructura final del repositorio e incorporar en README.md los requisitos, la instalación, el orden de ejecución de los notebooks, el uso de la aplicación y la descripción de las carpetas.</w:t>
+        <w:t>La estructura completa de carpetas, el orden de ejecución de los notebooks, la instalación de dependencias y las instrucciones para levantar el backend y el frontend están documentadas en README.md y configuracion_entorno.md, ubicados en la raíz del repositorio.</w:t>
       </w:r>
     </w:p>
     <w:p>
@@ -27924,6 +28502,7 @@
       <w:pPr>
         <w:spacing w:after="80" w:line="276" w:lineRule="auto"/>
         <w:ind w:left="360" w:hanging="360"/>
+        <w:jc w:val="both"/>
         <w:rPr>
           <w:rFonts w:asciiTheme="minorHAnsi" w:hAnsiTheme="minorHAnsi" w:cstheme="minorHAnsi"/>
         </w:rPr>
@@ -28072,21 +28651,7 @@
         <w:rPr>
           <w:rFonts w:asciiTheme="minorHAnsi" w:hAnsiTheme="minorHAnsi" w:cstheme="minorHAnsi"/>
         </w:rPr>
-        <w:t xml:space="preserve"> </w:t>
-      </w:r>
-      <w:proofErr w:type="spellStart"/>
-      <w:r>
-        <w:rPr>
-          <w:rFonts w:asciiTheme="minorHAnsi" w:hAnsiTheme="minorHAnsi" w:cstheme="minorHAnsi"/>
-        </w:rPr>
-        <w:t>of</w:t>
-      </w:r>
-      <w:proofErr w:type="spellEnd"/>
-      <w:r>
-        <w:rPr>
-          <w:rFonts w:asciiTheme="minorHAnsi" w:hAnsiTheme="minorHAnsi" w:cstheme="minorHAnsi"/>
-        </w:rPr>
-        <w:t xml:space="preserve"> Big Data, 6, </w:t>
+        <w:t xml:space="preserve"> of Big Data, 6, </w:t>
       </w:r>
       <w:proofErr w:type="spellStart"/>
       <w:r>
@@ -28107,6 +28672,7 @@
       <w:pPr>
         <w:spacing w:after="80" w:line="276" w:lineRule="auto"/>
         <w:ind w:left="360" w:hanging="360"/>
+        <w:jc w:val="both"/>
         <w:rPr>
           <w:rFonts w:asciiTheme="minorHAnsi" w:hAnsiTheme="minorHAnsi" w:cstheme="minorHAnsi"/>
         </w:rPr>
@@ -28340,6 +28906,7 @@
       <w:pPr>
         <w:spacing w:after="80" w:line="276" w:lineRule="auto"/>
         <w:ind w:left="360" w:hanging="360"/>
+        <w:jc w:val="both"/>
         <w:rPr>
           <w:rFonts w:asciiTheme="minorHAnsi" w:hAnsiTheme="minorHAnsi" w:cstheme="minorHAnsi"/>
         </w:rPr>
@@ -28481,6 +29048,7 @@
       <w:pPr>
         <w:spacing w:after="80" w:line="276" w:lineRule="auto"/>
         <w:ind w:left="360" w:hanging="360"/>
+        <w:jc w:val="both"/>
         <w:rPr>
           <w:rFonts w:asciiTheme="minorHAnsi" w:hAnsiTheme="minorHAnsi" w:cstheme="minorHAnsi"/>
         </w:rPr>
@@ -28658,6 +29226,7 @@
       <w:pPr>
         <w:spacing w:after="80" w:line="276" w:lineRule="auto"/>
         <w:ind w:left="360" w:hanging="360"/>
+        <w:jc w:val="both"/>
         <w:rPr>
           <w:rFonts w:asciiTheme="minorHAnsi" w:hAnsiTheme="minorHAnsi" w:cstheme="minorHAnsi"/>
         </w:rPr>
@@ -28835,6 +29404,7 @@
       <w:pPr>
         <w:spacing w:after="80" w:line="276" w:lineRule="auto"/>
         <w:ind w:left="360" w:hanging="360"/>
+        <w:jc w:val="both"/>
         <w:rPr>
           <w:rFonts w:asciiTheme="minorHAnsi" w:hAnsiTheme="minorHAnsi" w:cstheme="minorHAnsi"/>
         </w:rPr>
@@ -28900,6 +29470,7 @@
       <w:pPr>
         <w:spacing w:after="80" w:line="276" w:lineRule="auto"/>
         <w:ind w:left="360" w:hanging="360"/>
+        <w:jc w:val="both"/>
         <w:rPr>
           <w:rFonts w:asciiTheme="minorHAnsi" w:hAnsiTheme="minorHAnsi" w:cstheme="minorHAnsi"/>
         </w:rPr>
@@ -29063,6 +29634,7 @@
       <w:pPr>
         <w:spacing w:after="80" w:line="276" w:lineRule="auto"/>
         <w:ind w:left="360" w:hanging="360"/>
+        <w:jc w:val="both"/>
         <w:rPr>
           <w:rFonts w:asciiTheme="minorHAnsi" w:hAnsiTheme="minorHAnsi" w:cstheme="minorHAnsi"/>
         </w:rPr>
@@ -29226,6 +29798,7 @@
       <w:pPr>
         <w:spacing w:after="80" w:line="276" w:lineRule="auto"/>
         <w:ind w:left="360" w:hanging="360"/>
+        <w:jc w:val="both"/>
         <w:rPr>
           <w:rFonts w:asciiTheme="minorHAnsi" w:hAnsiTheme="minorHAnsi" w:cstheme="minorHAnsi"/>
         </w:rPr>
@@ -29465,6 +30038,7 @@
       <w:pPr>
         <w:spacing w:after="80" w:line="276" w:lineRule="auto"/>
         <w:ind w:left="360" w:hanging="360"/>
+        <w:jc w:val="both"/>
         <w:rPr>
           <w:rFonts w:asciiTheme="minorHAnsi" w:hAnsiTheme="minorHAnsi" w:cstheme="minorHAnsi"/>
         </w:rPr>
@@ -29635,13 +30209,14 @@
         <w:rPr>
           <w:rFonts w:asciiTheme="minorHAnsi" w:hAnsiTheme="minorHAnsi" w:cstheme="minorHAnsi"/>
         </w:rPr>
-        <w:t>, 34.</w:t>
+        <w:t>, 34. https://proceedings.neurips.cc/paper/2021/hash/9d86d83f925f2149e9edb0ac3b49229c-Abstract.html</w:t>
       </w:r>
     </w:p>
     <w:p>
       <w:pPr>
         <w:spacing w:after="80" w:line="276" w:lineRule="auto"/>
         <w:ind w:left="360" w:hanging="360"/>
+        <w:jc w:val="both"/>
         <w:rPr>
           <w:rFonts w:asciiTheme="minorHAnsi" w:hAnsiTheme="minorHAnsi" w:cstheme="minorHAnsi"/>
         </w:rPr>
@@ -29769,6 +30344,7 @@
       <w:pPr>
         <w:spacing w:after="80" w:line="276" w:lineRule="auto"/>
         <w:ind w:left="360" w:hanging="360"/>
+        <w:jc w:val="both"/>
         <w:rPr>
           <w:rFonts w:asciiTheme="minorHAnsi" w:hAnsiTheme="minorHAnsi" w:cstheme="minorHAnsi"/>
         </w:rPr>
@@ -30002,6 +30578,7 @@
       <w:pPr>
         <w:spacing w:after="80" w:line="276" w:lineRule="auto"/>
         <w:ind w:left="360" w:hanging="360"/>
+        <w:jc w:val="both"/>
         <w:rPr>
           <w:rFonts w:asciiTheme="minorHAnsi" w:hAnsiTheme="minorHAnsi" w:cstheme="minorHAnsi"/>
         </w:rPr>
@@ -30151,6 +30728,7 @@
       <w:pPr>
         <w:spacing w:after="80" w:line="276" w:lineRule="auto"/>
         <w:ind w:left="360" w:hanging="360"/>
+        <w:jc w:val="both"/>
         <w:rPr>
           <w:rFonts w:asciiTheme="minorHAnsi" w:hAnsiTheme="minorHAnsi" w:cstheme="minorHAnsi"/>
         </w:rPr>
@@ -30188,7 +30766,7 @@
         <w:rPr>
           <w:rFonts w:asciiTheme="minorHAnsi" w:hAnsiTheme="minorHAnsi" w:cstheme="minorHAnsi"/>
         </w:rPr>
-        <w:t>Churn</w:t>
+        <w:t>churn</w:t>
       </w:r>
       <w:proofErr w:type="spellEnd"/>
       <w:r>
@@ -30202,21 +30780,35 @@
         <w:rPr>
           <w:rFonts w:asciiTheme="minorHAnsi" w:hAnsiTheme="minorHAnsi" w:cstheme="minorHAnsi"/>
         </w:rPr>
-        <w:t>Prediction</w:t>
-      </w:r>
-      <w:proofErr w:type="spellEnd"/>
-      <w:r>
-        <w:rPr>
-          <w:rFonts w:asciiTheme="minorHAnsi" w:hAnsiTheme="minorHAnsi" w:cstheme="minorHAnsi"/>
-        </w:rPr>
-        <w:t xml:space="preserve"> Business </w:t>
-      </w:r>
-      <w:proofErr w:type="spellStart"/>
-      <w:r>
-        <w:rPr>
-          <w:rFonts w:asciiTheme="minorHAnsi" w:hAnsiTheme="minorHAnsi" w:cstheme="minorHAnsi"/>
-        </w:rPr>
-        <w:t>Dataset</w:t>
+        <w:t>prediction</w:t>
+      </w:r>
+      <w:proofErr w:type="spellEnd"/>
+      <w:r>
+        <w:rPr>
+          <w:rFonts w:asciiTheme="minorHAnsi" w:hAnsiTheme="minorHAnsi" w:cstheme="minorHAnsi"/>
+        </w:rPr>
+        <w:t xml:space="preserve"> </w:t>
+      </w:r>
+      <w:proofErr w:type="spellStart"/>
+      <w:r>
+        <w:rPr>
+          <w:rFonts w:asciiTheme="minorHAnsi" w:hAnsiTheme="minorHAnsi" w:cstheme="minorHAnsi"/>
+        </w:rPr>
+        <w:t>business</w:t>
+      </w:r>
+      <w:proofErr w:type="spellEnd"/>
+      <w:r>
+        <w:rPr>
+          <w:rFonts w:asciiTheme="minorHAnsi" w:hAnsiTheme="minorHAnsi" w:cstheme="minorHAnsi"/>
+        </w:rPr>
+        <w:t xml:space="preserve"> </w:t>
+      </w:r>
+      <w:proofErr w:type="spellStart"/>
+      <w:r>
+        <w:rPr>
+          <w:rFonts w:asciiTheme="minorHAnsi" w:hAnsiTheme="minorHAnsi" w:cstheme="minorHAnsi"/>
+        </w:rPr>
+        <w:t>dataset</w:t>
       </w:r>
       <w:proofErr w:type="spellEnd"/>
       <w:r>
@@ -30244,6 +30836,7 @@
       <w:pPr>
         <w:spacing w:after="80" w:line="276" w:lineRule="auto"/>
         <w:ind w:left="360" w:hanging="360"/>
+        <w:jc w:val="both"/>
         <w:rPr>
           <w:rFonts w:asciiTheme="minorHAnsi" w:hAnsiTheme="minorHAnsi" w:cstheme="minorHAnsi"/>
         </w:rPr>
@@ -30407,6 +31000,7 @@
       <w:pPr>
         <w:spacing w:after="80" w:line="276" w:lineRule="auto"/>
         <w:ind w:left="360" w:hanging="360"/>
+        <w:jc w:val="both"/>
         <w:rPr>
           <w:rFonts w:asciiTheme="minorHAnsi" w:hAnsiTheme="minorHAnsi" w:cstheme="minorHAnsi"/>
         </w:rPr>
@@ -30514,6 +31108,7 @@
       <w:pPr>
         <w:spacing w:after="80" w:line="276" w:lineRule="auto"/>
         <w:ind w:left="360" w:hanging="360"/>
+        <w:jc w:val="both"/>
         <w:rPr>
           <w:rFonts w:asciiTheme="minorHAnsi" w:hAnsiTheme="minorHAnsi" w:cstheme="minorHAnsi"/>
         </w:rPr>
@@ -30677,6 +31272,7 @@
       <w:pPr>
         <w:spacing w:after="80" w:line="276" w:lineRule="auto"/>
         <w:ind w:left="360" w:hanging="360"/>
+        <w:jc w:val="both"/>
         <w:rPr>
           <w:rFonts w:asciiTheme="minorHAnsi" w:hAnsiTheme="minorHAnsi" w:cstheme="minorHAnsi"/>
         </w:rPr>
@@ -30763,6 +31359,7 @@
       <w:pPr>
         <w:spacing w:after="80" w:line="276" w:lineRule="auto"/>
         <w:ind w:left="360" w:hanging="360"/>
+        <w:jc w:val="both"/>
         <w:rPr>
           <w:rFonts w:asciiTheme="minorHAnsi" w:hAnsiTheme="minorHAnsi" w:cstheme="minorHAnsi"/>
         </w:rPr>
@@ -30979,8 +31576,8 @@
       </w:r>
     </w:p>
     <w:sectPr>
-      <w:headerReference w:type="default" r:id="rId48"/>
-      <w:footerReference w:type="default" r:id="rId49"/>
+      <w:headerReference w:type="default" r:id="rId53"/>
+      <w:footerReference w:type="default" r:id="rId54"/>
       <w:pgSz w:w="12240" w:h="15840"/>
       <w:pgMar w:top="1100" w:right="840" w:bottom="1340" w:left="1020" w:header="493" w:footer="1149" w:gutter="0"/>
       <w:cols w:space="720"/>
@@ -33756,10 +34353,6 @@
 </file>
 
 <file path=customXml/item1.xml><?xml version="1.0" encoding="utf-8"?>
-<b:Sources xmlns:b="http://schemas.openxmlformats.org/officeDocument/2006/bibliography" xmlns="http://schemas.openxmlformats.org/officeDocument/2006/bibliography" SelectedStyle="\APASixthEditionOfficeOnline.xsl" StyleName="APA" Version="6"/>
-</file>
-
-<file path=customXml/item2.xml><?xml version="1.0" encoding="utf-8"?>
 <p:properties xmlns:p="http://schemas.microsoft.com/office/2006/metadata/properties" xmlns:xsi="http://www.w3.org/2001/XMLSchema-instance" xmlns:pc="http://schemas.microsoft.com/office/infopath/2007/PartnerControls">
   <documentManagement>
     <TaxCatchAll xmlns="34e9bb24-f277-4b2e-b702-727ad1819a53" xsi:nil="true"/>
@@ -33768,6 +34361,15 @@
     </lcf76f155ced4ddcb4097134ff3c332f>
   </documentManagement>
 </p:properties>
+</file>
+
+<file path=customXml/item2.xml><?xml version="1.0" encoding="utf-8"?>
+<?mso-contentType ?>
+<FormTemplates xmlns="http://schemas.microsoft.com/sharepoint/v3/contenttype/forms">
+  <Display>DocumentLibraryForm</Display>
+  <Edit>DocumentLibraryForm</Edit>
+  <New>DocumentLibraryForm</New>
+</FormTemplates>
 </file>
 
 <file path=customXml/item3.xml><?xml version="1.0" encoding="utf-8"?>
@@ -33966,29 +34568,24 @@
 </file>
 
 <file path=customXml/item4.xml><?xml version="1.0" encoding="utf-8"?>
-<?mso-contentType ?>
-<FormTemplates xmlns="http://schemas.microsoft.com/sharepoint/v3/contenttype/forms">
-  <Display>DocumentLibraryForm</Display>
-  <Edit>DocumentLibraryForm</Edit>
-  <New>DocumentLibraryForm</New>
-</FormTemplates>
+<b:Sources xmlns:b="http://schemas.openxmlformats.org/officeDocument/2006/bibliography" xmlns="http://schemas.openxmlformats.org/officeDocument/2006/bibliography" SelectedStyle="\APASixthEditionOfficeOnline.xsl" StyleName="APA" Version="6"/>
 </file>
 
 <file path=customXml/itemProps1.xml><?xml version="1.0" encoding="utf-8"?>
-<ds:datastoreItem xmlns:ds="http://schemas.openxmlformats.org/officeDocument/2006/customXml" ds:itemID="{FACB83BB-458E-4CCB-91D7-35CFBA93934D}">
-  <ds:schemaRefs>
-    <ds:schemaRef ds:uri="http://schemas.openxmlformats.org/officeDocument/2006/bibliography"/>
-  </ds:schemaRefs>
-</ds:datastoreItem>
-</file>
-
-<file path=customXml/itemProps2.xml><?xml version="1.0" encoding="utf-8"?>
 <ds:datastoreItem xmlns:ds="http://schemas.openxmlformats.org/officeDocument/2006/customXml" ds:itemID="{662F60C8-4BC5-4139-BE63-6954D22D77BD}">
   <ds:schemaRefs>
     <ds:schemaRef ds:uri="http://schemas.microsoft.com/office/2006/metadata/properties"/>
     <ds:schemaRef ds:uri="http://schemas.microsoft.com/office/infopath/2007/PartnerControls"/>
     <ds:schemaRef ds:uri="34e9bb24-f277-4b2e-b702-727ad1819a53"/>
     <ds:schemaRef ds:uri="4653439a-09b5-4ebc-9f65-223c4545ca76"/>
+  </ds:schemaRefs>
+</ds:datastoreItem>
+</file>
+
+<file path=customXml/itemProps2.xml><?xml version="1.0" encoding="utf-8"?>
+<ds:datastoreItem xmlns:ds="http://schemas.openxmlformats.org/officeDocument/2006/customXml" ds:itemID="{084C26D9-49C9-4ADB-A387-DA6079798921}">
+  <ds:schemaRefs>
+    <ds:schemaRef ds:uri="http://schemas.microsoft.com/sharepoint/v3/contenttype/forms"/>
   </ds:schemaRefs>
 </ds:datastoreItem>
 </file>
@@ -34013,9 +34610,9 @@
 </file>
 
 <file path=customXml/itemProps4.xml><?xml version="1.0" encoding="utf-8"?>
-<ds:datastoreItem xmlns:ds="http://schemas.openxmlformats.org/officeDocument/2006/customXml" ds:itemID="{084C26D9-49C9-4ADB-A387-DA6079798921}">
+<ds:datastoreItem xmlns:ds="http://schemas.openxmlformats.org/officeDocument/2006/customXml" ds:itemID="{FACB83BB-458E-4CCB-91D7-35CFBA93934D}">
   <ds:schemaRefs>
-    <ds:schemaRef ds:uri="http://schemas.microsoft.com/sharepoint/v3/contenttype/forms"/>
+    <ds:schemaRef ds:uri="http://schemas.openxmlformats.org/officeDocument/2006/bibliography"/>
   </ds:schemaRefs>
 </ds:datastoreItem>
 </file>
</xml_diff>